<commit_message>
Report updated: full exp01-05 arc, headline AURC table, hard-scene figure leads
</commit_message>
<xml_diff>
--- a/reports/2026-08-31_first_experiments.docx
+++ b/reports/2026-08-31_first_experiments.docx
@@ -26,7 +26,7 @@
           <w:sz w:val="18"/>
           <w:szCs w:val="18"/>
         </w:rPr>
-        <w:t xml:space="preserve">First experiments. 2026-08-31. Repo: olmoearth_inferenceX (experimental).</w:t>
+        <w:t xml:space="preserve">First experiments (exp01-exp05). 2026-08-31. Repo: olmoearth_inferenceX (experimental).</w:t>
       </w:r>
     </w:p>
     <w:p>
@@ -43,7 +43,7 @@
         <w:spacing w:after="120"/>
       </w:pPr>
       <w:r>
-        <w:t xml:space="preserve">OlmoEarth fine-tuned models produce predictions over regions where no ground-truth labels exist. Supervised eval metrics cannot say anything there. The goal of this project is an audit signal: take an inference output and rank where it is most likely wrong, with the evidence attached. The output is a ranked list of suspect windows and risk-coverage curves, not a single accuracy number, because trustworthiness has no universal ground truth to certify against.</w:t>
+        <w:t xml:space="preserve">OlmoEarth fine-tuned models produce predictions over regions where no ground-truth labels exist, and supervised eval metrics cannot say anything there. The goal is an audit: take an inference output and rank where it is most likely wrong, with the evidence attached. The output is a ranked list of suspect windows and risk-coverage curves, not a single accuracy number, because trustworthiness has no universal ground truth to certify against.</w:t>
       </w:r>
     </w:p>
     <w:p>
@@ -60,7 +60,7 @@
         <w:spacing w:after="120"/>
       </w:pPr>
       <w:r>
-        <w:t xml:space="preserve">The LLM community has spent several years on the same problem under the name hallucination detection: judging outputs with no reference answer. Those techniques mostly do not depend on language, so they should port to earth observation, the same way the RoPE fix in OlmoEarth v1.2 ported an LLM mechanism to fix the v1 striping artifact.</w:t>
+        <w:t xml:space="preserve">The LLM community has spent several years on the same problem under the name hallucination detection: judging outputs with no reference answer. Those techniques mostly do not depend on language, so they port to earth observation, the same way the RoPE fix in OlmoEarth v1.2 ported an LLM mechanism to fix the v1 striping artifact.</w:t>
       </w:r>
     </w:p>
     <w:tbl>
@@ -158,7 +158,7 @@
                 <w:sz w:val="18"/>
                 <w:szCs w:val="18"/>
               </w:rPr>
-              <w:t xml:space="preserve">Model disagreement</w:t>
+              <w:t xml:space="preserve">Model disagreement (E_case)</w:t>
             </w:r>
           </w:p>
         </w:tc>
@@ -217,7 +217,7 @@
                 <w:sz w:val="18"/>
                 <w:szCs w:val="18"/>
               </w:rPr>
-              <w:t xml:space="preserve">Perturbation stability</w:t>
+              <w:t xml:space="preserve">Perturbation stability (E_system)</w:t>
             </w:r>
           </w:p>
         </w:tc>
@@ -276,7 +276,7 @@
                 <w:sz w:val="18"/>
                 <w:szCs w:val="18"/>
               </w:rPr>
-              <w:t xml:space="preserve">Geographic grounding</w:t>
+              <w:t xml:space="preserve">Geographic grounding (E_geo)</w:t>
             </w:r>
           </w:p>
         </w:tc>
@@ -335,7 +335,7 @@
                 <w:sz w:val="18"/>
                 <w:szCs w:val="18"/>
               </w:rPr>
-              <w:t xml:space="preserve">Embedding dissimilarity</w:t>
+              <w:t xml:space="preserve">Embedding dissimilarity (E_dist)</w:t>
             </w:r>
           </w:p>
         </w:tc>
@@ -373,7 +373,7 @@
                 <w:sz w:val="18"/>
                 <w:szCs w:val="18"/>
               </w:rPr>
-              <w:t xml:space="preserve">Distance from training distribution in embedding space; no reruns needed</w:t>
+              <w:t xml:space="preserve">k-NN distance from training distribution in embedding space; no reruns needed</w:t>
             </w:r>
           </w:p>
         </w:tc>
@@ -392,7 +392,7 @@
         <w:spacing w:after="120"/>
       </w:pPr>
       <w:r>
-        <w:t xml:space="preserve">Two rules keep the audit honest. First, the signals are validated on partner projects that do have labels, then run where labels do not exist; labels grade the signals but never train them. Second, every ranking is compared against the max-softmax confidence of the model itself, since any technique that cannot beat the model's own confidence is not worth shipping.</w:t>
+        <w:t xml:space="preserve">Two rules keep the audit honest. Signals are validated on labeled data but never trained on it. And every ranking is compared against the max-softmax confidence of the audited model itself, because a technique that cannot beat the model's own confidence is not worth shipping.</w:t>
       </w:r>
     </w:p>
     <w:p>
@@ -401,68 +401,7 @@
         <w:spacing w:after="120" w:before="240"/>
       </w:pPr>
       <w:r>
-        <w:t xml:space="preserve">3. Setup</w:t>
-      </w:r>
-    </w:p>
-    <w:p>
-      <w:pPr>
-        <w:pStyle w:val="ListParagraph"/>
-        <w:numPr>
-          <w:ilvl w:val="0"/>
-          <w:numId w:val="2"/>
-        </w:numPr>
-        <w:spacing w:after="80"/>
-      </w:pPr>
-      <w:r>
-        <w:t xml:space="preserve">Models: OlmoEarth v1 Nano (128-d) and Base (768-d), public HuggingFace checkpoints, CPU inference, patch size 4. All v1 / v1_1 / v1_2 checkpoints are public, so multi-model and cross-version comparisons need no infrastructure.</w:t>
-      </w:r>
-    </w:p>
-    <w:p>
-      <w:pPr>
-        <w:pStyle w:val="ListParagraph"/>
-        <w:numPr>
-          <w:ilvl w:val="0"/>
-          <w:numId w:val="2"/>
-        </w:numPr>
-        <w:spacing w:after="80"/>
-      </w:pPr>
-      <w:r>
-        <w:t xml:space="preserve">Imagery: single Sentinel-2 L2A scenes from Planetary Computer, dry season 2024, under 5% cloud, 128x128 pixel windows at 10 m.</w:t>
-      </w:r>
-    </w:p>
-    <w:p>
-      <w:pPr>
-        <w:pStyle w:val="ListParagraph"/>
-        <w:numPr>
-          <w:ilvl w:val="0"/>
-          <w:numId w:val="2"/>
-        </w:numPr>
-        <w:spacing w:after="80"/>
-      </w:pPr>
-      <w:r>
-        <w:t xml:space="preserve">Weak truth: ESA WorldCover 2021 water class, pooled to the patch grid.</w:t>
-      </w:r>
-    </w:p>
-    <w:p>
-      <w:pPr>
-        <w:pStyle w:val="ListParagraph"/>
-        <w:numPr>
-          <w:ilvl w:val="0"/>
-          <w:numId w:val="2"/>
-        </w:numPr>
-        <w:spacing w:after="80"/>
-      </w:pPr>
-      <w:r>
-        <w:t xml:space="preserve">Reference geography: OSM waterway centerlines.</w:t>
-      </w:r>
-    </w:p>
-    <w:p>
-      <w:pPr>
-        <w:pStyle w:val="Heading1"/>
-        <w:spacing w:after="120" w:before="240"/>
-      </w:pPr>
-      <w:r>
-        <w:t xml:space="preserve">4. Experiment 1: where do two models disagree?</w:t>
+        <w:t xml:space="preserve">3. Headline result</w:t>
       </w:r>
     </w:p>
     <w:p>
@@ -470,7 +409,436 @@
         <w:spacing w:after="120"/>
       </w:pPr>
       <w:r>
-        <w:t xml:space="preserve">Nano and Base embeddings over the Zambezi at Kazungula. For each patch, the local cosine-similarity structure of the two models is correlated: high correlation means both models represent the patch and its neighborhood the same way. Calibration first: on pure random input the mean agreement is 0.59, not 0, because the models share patchification and normalization. All agreement numbers must be read against that floor.</w:t>
+        <w:t xml:space="preserve">One day of experiments maps where the model's own confidence works and where the evidence channels earn their keep. Confidence wins on in-domain class confusion. It collapses on ambiguous wetland margins and under domain shift, where every evidence channel beats it, each strongest in its own regime:</w:t>
+      </w:r>
+    </w:p>
+    <w:tbl>
+      <w:tblPr>
+        <w:tblW w:type="dxa" w:w="9320"/>
+        <w:tblBorders>
+          <w:top w:val="single" w:color="auto" w:sz="4"/>
+          <w:left w:val="single" w:color="auto" w:sz="4"/>
+          <w:bottom w:val="single" w:color="auto" w:sz="4"/>
+          <w:right w:val="single" w:color="auto" w:sz="4"/>
+          <w:insideH w:val="single" w:color="auto" w:sz="4"/>
+          <w:insideV w:val="single" w:color="auto" w:sz="4"/>
+        </w:tblBorders>
+      </w:tblPr>
+      <w:tblGrid>
+        <w:gridCol w:w="3200"/>
+        <w:gridCol w:w="2040"/>
+        <w:gridCol w:w="2040"/>
+        <w:gridCol w:w="2040"/>
+      </w:tblGrid>
+      <w:tr>
+        <w:tc>
+          <w:tcPr>
+            <w:tcW w:type="dxa" w:w="3200"/>
+            <w:shd w:fill="E8E8E8" w:val="clear"/>
+          </w:tcPr>
+          <w:p>
+            <w:pPr>
+              <w:spacing w:after="40"/>
+            </w:pPr>
+            <w:r>
+              <w:rPr>
+                <w:b/>
+                <w:bCs/>
+                <w:sz w:val="18"/>
+                <w:szCs w:val="18"/>
+              </w:rPr>
+              <w:t xml:space="preserve">AURC (lower = better ranking)</w:t>
+            </w:r>
+          </w:p>
+        </w:tc>
+        <w:tc>
+          <w:tcPr>
+            <w:tcW w:type="dxa" w:w="2040"/>
+            <w:shd w:fill="E8E8E8" w:val="clear"/>
+          </w:tcPr>
+          <w:p>
+            <w:pPr>
+              <w:spacing w:after="40"/>
+            </w:pPr>
+            <w:r>
+              <w:rPr>
+                <w:b/>
+                <w:bCs/>
+                <w:sz w:val="18"/>
+                <w:szCs w:val="18"/>
+              </w:rPr>
+              <w:t xml:space="preserve">In-domain, expert labels (AWF, 9-class)</w:t>
+            </w:r>
+          </w:p>
+        </w:tc>
+        <w:tc>
+          <w:tcPr>
+            <w:tcW w:type="dxa" w:w="2040"/>
+            <w:shd w:fill="E8E8E8" w:val="clear"/>
+          </w:tcPr>
+          <w:p>
+            <w:pPr>
+              <w:spacing w:after="40"/>
+            </w:pPr>
+            <w:r>
+              <w:rPr>
+                <w:b/>
+                <w:bCs/>
+                <w:sz w:val="18"/>
+                <w:szCs w:val="18"/>
+              </w:rPr>
+              <w:t xml:space="preserve">Wetland margins (Barotse)</w:t>
+            </w:r>
+          </w:p>
+        </w:tc>
+        <w:tc>
+          <w:tcPr>
+            <w:tcW w:type="dxa" w:w="2040"/>
+            <w:shd w:fill="E8E8E8" w:val="clear"/>
+          </w:tcPr>
+          <w:p>
+            <w:pPr>
+              <w:spacing w:after="40"/>
+            </w:pPr>
+            <w:r>
+              <w:rPr>
+                <w:b/>
+                <w:bCs/>
+                <w:sz w:val="18"/>
+                <w:szCs w:val="18"/>
+              </w:rPr>
+              <w:t xml:space="preserve">Domain shift (mangrove delta)</w:t>
+            </w:r>
+          </w:p>
+        </w:tc>
+      </w:tr>
+      <w:tr>
+        <w:tc>
+          <w:tcPr>
+            <w:tcW w:type="dxa" w:w="3200"/>
+          </w:tcPr>
+          <w:p>
+            <w:pPr>
+              <w:spacing w:after="40"/>
+            </w:pPr>
+            <w:r>
+              <w:rPr>
+                <w:b w:val="false"/>
+                <w:bCs w:val="false"/>
+                <w:sz w:val="18"/>
+                <w:szCs w:val="18"/>
+              </w:rPr>
+              <w:t xml:space="preserve">Baseline max-softmax</w:t>
+            </w:r>
+          </w:p>
+        </w:tc>
+        <w:tc>
+          <w:tcPr>
+            <w:tcW w:type="dxa" w:w="2040"/>
+          </w:tcPr>
+          <w:p>
+            <w:pPr>
+              <w:spacing w:after="40"/>
+            </w:pPr>
+            <w:r>
+              <w:rPr>
+                <w:b w:val="false"/>
+                <w:bCs w:val="false"/>
+                <w:sz w:val="18"/>
+                <w:szCs w:val="18"/>
+              </w:rPr>
+              <w:t xml:space="preserve">0.0367  (best)</w:t>
+            </w:r>
+          </w:p>
+        </w:tc>
+        <w:tc>
+          <w:tcPr>
+            <w:tcW w:type="dxa" w:w="2040"/>
+          </w:tcPr>
+          <w:p>
+            <w:pPr>
+              <w:spacing w:after="40"/>
+            </w:pPr>
+            <w:r>
+              <w:rPr>
+                <w:b w:val="false"/>
+                <w:bCs w:val="false"/>
+                <w:sz w:val="18"/>
+                <w:szCs w:val="18"/>
+              </w:rPr>
+              <w:t xml:space="preserve">0.0666</w:t>
+            </w:r>
+          </w:p>
+        </w:tc>
+        <w:tc>
+          <w:tcPr>
+            <w:tcW w:type="dxa" w:w="2040"/>
+          </w:tcPr>
+          <w:p>
+            <w:pPr>
+              <w:spacing w:after="40"/>
+            </w:pPr>
+            <w:r>
+              <w:rPr>
+                <w:b w:val="false"/>
+                <w:bCs w:val="false"/>
+                <w:sz w:val="18"/>
+                <w:szCs w:val="18"/>
+              </w:rPr>
+              <w:t xml:space="preserve">0.0258</w:t>
+            </w:r>
+          </w:p>
+        </w:tc>
+      </w:tr>
+      <w:tr>
+        <w:tc>
+          <w:tcPr>
+            <w:tcW w:type="dxa" w:w="3200"/>
+          </w:tcPr>
+          <w:p>
+            <w:pPr>
+              <w:spacing w:after="40"/>
+            </w:pPr>
+            <w:r>
+              <w:rPr>
+                <w:b w:val="false"/>
+                <w:bCs w:val="false"/>
+                <w:sz w:val="18"/>
+                <w:szCs w:val="18"/>
+              </w:rPr>
+              <w:t xml:space="preserve">E_case model disagreement</w:t>
+            </w:r>
+          </w:p>
+        </w:tc>
+        <w:tc>
+          <w:tcPr>
+            <w:tcW w:type="dxa" w:w="2040"/>
+          </w:tcPr>
+          <w:p>
+            <w:pPr>
+              <w:spacing w:after="40"/>
+            </w:pPr>
+            <w:r>
+              <w:rPr>
+                <w:b w:val="false"/>
+                <w:bCs w:val="false"/>
+                <w:sz w:val="18"/>
+                <w:szCs w:val="18"/>
+              </w:rPr>
+              <w:t xml:space="preserve">0.0533</w:t>
+            </w:r>
+          </w:p>
+        </w:tc>
+        <w:tc>
+          <w:tcPr>
+            <w:tcW w:type="dxa" w:w="2040"/>
+          </w:tcPr>
+          <w:p>
+            <w:pPr>
+              <w:spacing w:after="40"/>
+            </w:pPr>
+            <w:r>
+              <w:rPr>
+                <w:b w:val="false"/>
+                <w:bCs w:val="false"/>
+                <w:sz w:val="18"/>
+                <w:szCs w:val="18"/>
+              </w:rPr>
+              <w:t xml:space="preserve">0.0235  (best, 3x)</w:t>
+            </w:r>
+          </w:p>
+        </w:tc>
+        <w:tc>
+          <w:tcPr>
+            <w:tcW w:type="dxa" w:w="2040"/>
+          </w:tcPr>
+          <w:p>
+            <w:pPr>
+              <w:spacing w:after="40"/>
+            </w:pPr>
+            <w:r>
+              <w:rPr>
+                <w:b w:val="false"/>
+                <w:bCs w:val="false"/>
+                <w:sz w:val="18"/>
+                <w:szCs w:val="18"/>
+              </w:rPr>
+              <w:t xml:space="preserve">0.0103</w:t>
+            </w:r>
+          </w:p>
+        </w:tc>
+      </w:tr>
+      <w:tr>
+        <w:tc>
+          <w:tcPr>
+            <w:tcW w:type="dxa" w:w="3200"/>
+          </w:tcPr>
+          <w:p>
+            <w:pPr>
+              <w:spacing w:after="40"/>
+            </w:pPr>
+            <w:r>
+              <w:rPr>
+                <w:b w:val="false"/>
+                <w:bCs w:val="false"/>
+                <w:sz w:val="18"/>
+                <w:szCs w:val="18"/>
+              </w:rPr>
+              <w:t xml:space="preserve">E_system tile-phase</w:t>
+            </w:r>
+          </w:p>
+        </w:tc>
+        <w:tc>
+          <w:tcPr>
+            <w:tcW w:type="dxa" w:w="2040"/>
+          </w:tcPr>
+          <w:p>
+            <w:pPr>
+              <w:spacing w:after="40"/>
+            </w:pPr>
+            <w:r>
+              <w:rPr>
+                <w:b w:val="false"/>
+                <w:bCs w:val="false"/>
+                <w:sz w:val="18"/>
+                <w:szCs w:val="18"/>
+              </w:rPr>
+              <w:t xml:space="preserve">0.0427</w:t>
+            </w:r>
+          </w:p>
+        </w:tc>
+        <w:tc>
+          <w:tcPr>
+            <w:tcW w:type="dxa" w:w="2040"/>
+          </w:tcPr>
+          <w:p>
+            <w:pPr>
+              <w:spacing w:after="40"/>
+            </w:pPr>
+            <w:r>
+              <w:rPr>
+                <w:b w:val="false"/>
+                <w:bCs w:val="false"/>
+                <w:sz w:val="18"/>
+                <w:szCs w:val="18"/>
+              </w:rPr>
+              <w:t xml:space="preserve">0.0555</w:t>
+            </w:r>
+          </w:p>
+        </w:tc>
+        <w:tc>
+          <w:tcPr>
+            <w:tcW w:type="dxa" w:w="2040"/>
+          </w:tcPr>
+          <w:p>
+            <w:pPr>
+              <w:spacing w:after="40"/>
+            </w:pPr>
+            <w:r>
+              <w:rPr>
+                <w:b w:val="false"/>
+                <w:bCs w:val="false"/>
+                <w:sz w:val="18"/>
+                <w:szCs w:val="18"/>
+              </w:rPr>
+              <w:t xml:space="preserve">0.0076</w:t>
+            </w:r>
+          </w:p>
+        </w:tc>
+      </w:tr>
+      <w:tr>
+        <w:tc>
+          <w:tcPr>
+            <w:tcW w:type="dxa" w:w="3200"/>
+          </w:tcPr>
+          <w:p>
+            <w:pPr>
+              <w:spacing w:after="40"/>
+            </w:pPr>
+            <w:r>
+              <w:rPr>
+                <w:b w:val="false"/>
+                <w:bCs w:val="false"/>
+                <w:sz w:val="18"/>
+                <w:szCs w:val="18"/>
+              </w:rPr>
+              <w:t xml:space="preserve">E_dist knn-to-train</w:t>
+            </w:r>
+          </w:p>
+        </w:tc>
+        <w:tc>
+          <w:tcPr>
+            <w:tcW w:type="dxa" w:w="2040"/>
+          </w:tcPr>
+          <w:p>
+            <w:pPr>
+              <w:spacing w:after="40"/>
+            </w:pPr>
+            <w:r>
+              <w:rPr>
+                <w:b w:val="false"/>
+                <w:bCs w:val="false"/>
+                <w:sz w:val="18"/>
+                <w:szCs w:val="18"/>
+              </w:rPr>
+              <w:t xml:space="preserve">n/a</w:t>
+            </w:r>
+          </w:p>
+        </w:tc>
+        <w:tc>
+          <w:tcPr>
+            <w:tcW w:type="dxa" w:w="2040"/>
+          </w:tcPr>
+          <w:p>
+            <w:pPr>
+              <w:spacing w:after="40"/>
+            </w:pPr>
+            <w:r>
+              <w:rPr>
+                <w:b w:val="false"/>
+                <w:bCs w:val="false"/>
+                <w:sz w:val="18"/>
+                <w:szCs w:val="18"/>
+              </w:rPr>
+              <w:t xml:space="preserve">0.0289</w:t>
+            </w:r>
+          </w:p>
+        </w:tc>
+        <w:tc>
+          <w:tcPr>
+            <w:tcW w:type="dxa" w:w="2040"/>
+          </w:tcPr>
+          <w:p>
+            <w:pPr>
+              <w:spacing w:after="40"/>
+            </w:pPr>
+            <w:r>
+              <w:rPr>
+                <w:b w:val="false"/>
+                <w:bCs w:val="false"/>
+                <w:sz w:val="18"/>
+                <w:szCs w:val="18"/>
+              </w:rPr>
+              <w:t xml:space="preserve">0.0014  (best, 18x)</w:t>
+            </w:r>
+          </w:p>
+        </w:tc>
+      </w:tr>
+    </w:tbl>
+    <w:p>
+      <w:pPr>
+        <w:spacing w:after="120"/>
+      </w:pPr>
+      <w:r>
+        <w:t xml:space="preserve"/>
+      </w:r>
+    </w:p>
+    <w:p>
+      <w:pPr>
+        <w:spacing w:after="120"/>
+      </w:pPr>
+      <w:r>
+        <w:t xml:space="preserve">Column 1: frozen-Base head on the AWF partner project (expert labels from African Wildlife Foundation annotators, southern Kenya, official 1115/344 spatial split, 85.2% head accuracy vs 89.5% for the fully fine-tuned model). Columns 2-3: water task, heads trained at Katima Mulilo, evaluated on the Barotse floodplain interior and the Zambezi delta mangrove coast (~1300 km from training), scored against ESA WorldCover.</w:t>
       </w:r>
     </w:p>
     <w:p>
@@ -480,7 +848,7 @@
       <w:r>
         <w:drawing>
           <wp:inline distT="0" distB="0" distL="0" distR="0">
-            <wp:extent cx="5943600" cy="2705100"/>
+            <wp:extent cx="5943600" cy="2809875"/>
             <wp:effectExtent t="0" r="0" b="0" l="0"/>
             <wp:docPr id="1" name="" descr="" title=""/>
             <wp:cNvGraphicFramePr>
@@ -505,7 +873,7 @@
                   <pic:spPr bwMode="auto">
                     <a:xfrm>
                       <a:off x="0" y="0"/>
-                      <a:ext cx="5943600" cy="2705100"/>
+                      <a:ext cx="5943600" cy="2809875"/>
                     </a:xfrm>
                     <a:prstGeom prst="rect">
                       <a:avLst/>
@@ -530,15 +898,7 @@
           <w:sz w:val="18"/>
           <w:szCs w:val="18"/>
         </w:rPr>
-        <w:t xml:space="preserve">Figure 1. Sentinel-2 RGB at Kazungula (left) and Nano-Base local structure agreement (right). Open water agrees at 0.9+; disagreement concentrates on the shoreline and traces the bridge.</w:t>
-      </w:r>
-    </w:p>
-    <w:p>
-      <w:pPr>
-        <w:spacing w:after="120"/>
-      </w:pPr>
-      <w:r>
-        <w:t xml:space="preserve">Disagreement is not noise. It clusters at boundaries and thin structures, which is where segmentation errors live. Mean agreement 0.78 against the 0.59 floor.</w:t>
+        <w:t xml:space="preserve">Figure 1. The hard scenes. Baseline (blue) collapses on both; model disagreement leads on wetland margins (top), embedding distance dominates under domain shift (bottom). Caveat: WorldCover is weak truth on these terrains, and part of the delta 'errors' trace a narrow river the reference likely misses.</w:t>
       </w:r>
     </w:p>
     <w:p>
@@ -547,7 +907,16 @@
         <w:spacing w:after="120" w:before="240"/>
       </w:pPr>
       <w:r>
-        <w:t xml:space="preserve">5. Experiment 2: the full audit slice</w:t>
+        <w:t xml:space="preserve">4. Building blocks, in order</w:t>
+      </w:r>
+    </w:p>
+    <w:p>
+      <w:pPr>
+        <w:pStyle w:val="Heading2"/>
+        <w:spacing w:after="120" w:before="240"/>
+      </w:pPr>
+      <w:r>
+        <w:t xml:space="preserve">4.1 Where two models disagree (exp01)</w:t>
       </w:r>
     </w:p>
     <w:p>
@@ -555,7 +924,7 @@
         <w:spacing w:after="120"/>
       </w:pPr>
       <w:r>
-        <w:t xml:space="preserve">Every stage of the audit pipeline, each at minimal depth. Water heads (logistic regression on frozen embeddings) trained at Katima Mulilo, evaluated at Kazungula, about 110 km away, so the split is spatial. Signals computed on the eval window: model disagreement (absolute difference of the two water probabilities), geographic grounding (OSM centerline patches that both models predict dry), and the max-softmax baseline. All scored against WorldCover via risk-coverage.</w:t>
+        <w:t xml:space="preserve">Nano and Base embeddings over the Zambezi at Kazungula, comparing local similarity structure per patch. Calibration first: on pure random input mean agreement is 0.59, not 0, because the models share patchification and normalization; all agreement reads against that floor. On the real scene disagreement is structured, not random: it clusters at boundaries and thin structures, where segmentation errors live.</w:t>
       </w:r>
     </w:p>
     <w:p>
@@ -565,7 +934,7 @@
       <w:r>
         <w:drawing>
           <wp:inline distT="0" distB="0" distL="0" distR="0">
-            <wp:extent cx="5943600" cy="3562350"/>
+            <wp:extent cx="5334000" cy="2428875"/>
             <wp:effectExtent t="0" r="0" b="0" l="0"/>
             <wp:docPr id="1" name="" descr="" title=""/>
             <wp:cNvGraphicFramePr>
@@ -590,6 +959,83 @@
                   <pic:spPr bwMode="auto">
                     <a:xfrm>
                       <a:off x="0" y="0"/>
+                      <a:ext cx="5334000" cy="2428875"/>
+                    </a:xfrm>
+                    <a:prstGeom prst="rect">
+                      <a:avLst/>
+                    </a:prstGeom>
+                  </pic:spPr>
+                </pic:pic>
+              </a:graphicData>
+            </a:graphic>
+          </wp:inline>
+        </w:drawing>
+      </w:r>
+    </w:p>
+    <w:p>
+      <w:pPr>
+        <w:spacing w:after="200"/>
+        <w:jc w:val="center"/>
+      </w:pPr>
+      <w:r>
+        <w:rPr>
+          <w:i/>
+          <w:iCs/>
+          <w:sz w:val="18"/>
+          <w:szCs w:val="18"/>
+        </w:rPr>
+        <w:t xml:space="preserve">Figure 2. Open water agrees at 0.9+; disagreement concentrates on the shoreline and traces the bridge.</w:t>
+      </w:r>
+    </w:p>
+    <w:p>
+      <w:pPr>
+        <w:pStyle w:val="Heading2"/>
+        <w:spacing w:after="120" w:before="240"/>
+      </w:pPr>
+      <w:r>
+        <w:t xml:space="preserve">4.2 The full audit slice (exp02)</w:t>
+      </w:r>
+    </w:p>
+    <w:p>
+      <w:pPr>
+        <w:spacing w:after="120"/>
+      </w:pPr>
+      <w:r>
+        <w:t xml:space="preserve">Every pipeline stage at minimal depth: water heads (logistic regression on frozen embeddings) trained at Katima Mulilo, evaluated at Kazungula 110 km away (spatial split), scored against WorldCover via risk-coverage. Spatial transfer reaches 97.9%. The geographic check is clean: 52 OSM centerline patches, zero false break alarms. And on this easy scene the baseline already edges the disagreement signal, which set up the question the rest of the day answered.</w:t>
+      </w:r>
+    </w:p>
+    <w:p>
+      <w:pPr>
+        <w:jc w:val="center"/>
+      </w:pPr>
+      <w:r>
+        <w:drawing>
+          <wp:inline distT="0" distB="0" distL="0" distR="0">
+            <wp:extent cx="5943600" cy="3562350"/>
+            <wp:effectExtent t="0" r="0" b="0" l="0"/>
+            <wp:docPr id="1" name="" descr="" title=""/>
+            <wp:cNvGraphicFramePr>
+              <a:graphicFrameLocks xmlns:a="http://schemas.openxmlformats.org/drawingml/2006/main" noChangeAspect="1"/>
+            </wp:cNvGraphicFramePr>
+            <a:graphic xmlns:a="http://schemas.openxmlformats.org/drawingml/2006/main">
+              <a:graphicData uri="http://schemas.openxmlformats.org/drawingml/2006/picture">
+                <pic:pic xmlns:pic="http://schemas.openxmlformats.org/drawingml/2006/picture">
+                  <pic:nvPicPr>
+                    <pic:cNvPr id="0" name="" descr=""/>
+                    <pic:cNvPicPr>
+                      <a:picLocks noChangeAspect="1" noChangeArrowheads="1"/>
+                    </pic:cNvPicPr>
+                  </pic:nvPicPr>
+                  <pic:blipFill>
+                    <a:blip r:embed="rId9" cstate="none"/>
+                    <a:srcRect/>
+                    <a:stretch>
+                      <a:fillRect/>
+                    </a:stretch>
+                  </pic:blipFill>
+                  <pic:spPr bwMode="auto">
+                    <a:xfrm>
+                      <a:off x="0" y="0"/>
                       <a:ext cx="5943600" cy="3562350"/>
                     </a:xfrm>
                     <a:prstGeom prst="rect">
@@ -615,458 +1061,16 @@
           <w:sz w:val="18"/>
           <w:szCs w:val="18"/>
         </w:rPr>
-        <w:t xml:space="preserve">Figure 2. Full slice at Kazungula: weak truth, Base prediction, errors, disagreement map, centerline check, and risk-coverage curves.</w:t>
-      </w:r>
-    </w:p>
-    <w:tbl>
-      <w:tblPr>
-        <w:tblW w:type="dxa" w:w="9320"/>
-        <w:tblBorders>
-          <w:top w:val="single" w:color="auto" w:sz="4"/>
-          <w:left w:val="single" w:color="auto" w:sz="4"/>
-          <w:bottom w:val="single" w:color="auto" w:sz="4"/>
-          <w:right w:val="single" w:color="auto" w:sz="4"/>
-          <w:insideH w:val="single" w:color="auto" w:sz="4"/>
-          <w:insideV w:val="single" w:color="auto" w:sz="4"/>
-        </w:tblBorders>
-      </w:tblPr>
-      <w:tblGrid>
-        <w:gridCol w:w="4660"/>
-        <w:gridCol w:w="2330"/>
-        <w:gridCol w:w="2330"/>
-      </w:tblGrid>
-      <w:tr>
-        <w:tc>
-          <w:tcPr>
-            <w:tcW w:type="dxa" w:w="4660"/>
-            <w:shd w:fill="E8E8E8" w:val="clear"/>
-          </w:tcPr>
-          <w:p>
-            <w:pPr>
-              <w:spacing w:after="40"/>
-            </w:pPr>
-            <w:r>
-              <w:rPr>
-                <w:b/>
-                <w:bCs/>
-                <w:sz w:val="18"/>
-                <w:szCs w:val="18"/>
-              </w:rPr>
-              <w:t xml:space="preserve">Metric</w:t>
-            </w:r>
-          </w:p>
-        </w:tc>
-        <w:tc>
-          <w:tcPr>
-            <w:tcW w:type="dxa" w:w="2330"/>
-            <w:shd w:fill="E8E8E8" w:val="clear"/>
-          </w:tcPr>
-          <w:p>
-            <w:pPr>
-              <w:spacing w:after="40"/>
-            </w:pPr>
-            <w:r>
-              <w:rPr>
-                <w:b/>
-                <w:bCs/>
-                <w:sz w:val="18"/>
-                <w:szCs w:val="18"/>
-              </w:rPr>
-              <w:t xml:space="preserve">Value</w:t>
-            </w:r>
-          </w:p>
-        </w:tc>
-        <w:tc>
-          <w:tcPr>
-            <w:tcW w:type="dxa" w:w="2330"/>
-            <w:shd w:fill="E8E8E8" w:val="clear"/>
-          </w:tcPr>
-          <w:p>
-            <w:pPr>
-              <w:spacing w:after="40"/>
-            </w:pPr>
-            <w:r>
-              <w:rPr>
-                <w:b/>
-                <w:bCs/>
-                <w:sz w:val="18"/>
-                <w:szCs w:val="18"/>
-              </w:rPr>
-              <w:t xml:space="preserve">Note</w:t>
-            </w:r>
-          </w:p>
-        </w:tc>
-      </w:tr>
-      <w:tr>
-        <w:tc>
-          <w:tcPr>
-            <w:tcW w:type="dxa" w:w="4660"/>
-          </w:tcPr>
-          <w:p>
-            <w:pPr>
-              <w:spacing w:after="40"/>
-            </w:pPr>
-            <w:r>
-              <w:rPr>
-                <w:b w:val="false"/>
-                <w:bCs w:val="false"/>
-                <w:sz w:val="18"/>
-                <w:szCs w:val="18"/>
-              </w:rPr>
-              <w:t xml:space="preserve">Nano head accuracy at eval AOI</w:t>
-            </w:r>
-          </w:p>
-        </w:tc>
-        <w:tc>
-          <w:tcPr>
-            <w:tcW w:type="dxa" w:w="2330"/>
-          </w:tcPr>
-          <w:p>
-            <w:pPr>
-              <w:spacing w:after="40"/>
-            </w:pPr>
-            <w:r>
-              <w:rPr>
-                <w:b w:val="false"/>
-                <w:bCs w:val="false"/>
-                <w:sz w:val="18"/>
-                <w:szCs w:val="18"/>
-              </w:rPr>
-              <w:t xml:space="preserve">0.973</w:t>
-            </w:r>
-          </w:p>
-        </w:tc>
-        <w:tc>
-          <w:tcPr>
-            <w:tcW w:type="dxa" w:w="2330"/>
-          </w:tcPr>
-          <w:p>
-            <w:pPr>
-              <w:spacing w:after="40"/>
-            </w:pPr>
-            <w:r>
-              <w:rPr>
-                <w:b w:val="false"/>
-                <w:bCs w:val="false"/>
-                <w:sz w:val="18"/>
-                <w:szCs w:val="18"/>
-              </w:rPr>
-              <w:t xml:space="preserve">vs WorldCover</w:t>
-            </w:r>
-          </w:p>
-        </w:tc>
-      </w:tr>
-      <w:tr>
-        <w:tc>
-          <w:tcPr>
-            <w:tcW w:type="dxa" w:w="4660"/>
-          </w:tcPr>
-          <w:p>
-            <w:pPr>
-              <w:spacing w:after="40"/>
-            </w:pPr>
-            <w:r>
-              <w:rPr>
-                <w:b w:val="false"/>
-                <w:bCs w:val="false"/>
-                <w:sz w:val="18"/>
-                <w:szCs w:val="18"/>
-              </w:rPr>
-              <w:t xml:space="preserve">Base head accuracy at eval AOI</w:t>
-            </w:r>
-          </w:p>
-        </w:tc>
-        <w:tc>
-          <w:tcPr>
-            <w:tcW w:type="dxa" w:w="2330"/>
-          </w:tcPr>
-          <w:p>
-            <w:pPr>
-              <w:spacing w:after="40"/>
-            </w:pPr>
-            <w:r>
-              <w:rPr>
-                <w:b w:val="false"/>
-                <w:bCs w:val="false"/>
-                <w:sz w:val="18"/>
-                <w:szCs w:val="18"/>
-              </w:rPr>
-              <w:t xml:space="preserve">0.979</w:t>
-            </w:r>
-          </w:p>
-        </w:tc>
-        <w:tc>
-          <w:tcPr>
-            <w:tcW w:type="dxa" w:w="2330"/>
-          </w:tcPr>
-          <w:p>
-            <w:pPr>
-              <w:spacing w:after="40"/>
-            </w:pPr>
-            <w:r>
-              <w:rPr>
-                <w:b w:val="false"/>
-                <w:bCs w:val="false"/>
-                <w:sz w:val="18"/>
-                <w:szCs w:val="18"/>
-              </w:rPr>
-              <w:t xml:space="preserve">vs WorldCover</w:t>
-            </w:r>
-          </w:p>
-        </w:tc>
-      </w:tr>
-      <w:tr>
-        <w:tc>
-          <w:tcPr>
-            <w:tcW w:type="dxa" w:w="4660"/>
-          </w:tcPr>
-          <w:p>
-            <w:pPr>
-              <w:spacing w:after="40"/>
-            </w:pPr>
-            <w:r>
-              <w:rPr>
-                <w:b w:val="false"/>
-                <w:bCs w:val="false"/>
-                <w:sz w:val="18"/>
-                <w:szCs w:val="18"/>
-              </w:rPr>
-              <w:t xml:space="preserve">Base overall error rate</w:t>
-            </w:r>
-          </w:p>
-        </w:tc>
-        <w:tc>
-          <w:tcPr>
-            <w:tcW w:type="dxa" w:w="2330"/>
-          </w:tcPr>
-          <w:p>
-            <w:pPr>
-              <w:spacing w:after="40"/>
-            </w:pPr>
-            <w:r>
-              <w:rPr>
-                <w:b w:val="false"/>
-                <w:bCs w:val="false"/>
-                <w:sz w:val="18"/>
-                <w:szCs w:val="18"/>
-              </w:rPr>
-              <w:t xml:space="preserve">0.021</w:t>
-            </w:r>
-          </w:p>
-        </w:tc>
-        <w:tc>
-          <w:tcPr>
-            <w:tcW w:type="dxa" w:w="2330"/>
-          </w:tcPr>
-          <w:p>
-            <w:pPr>
-              <w:spacing w:after="40"/>
-            </w:pPr>
-            <w:r>
-              <w:rPr>
-                <w:b w:val="false"/>
-                <w:bCs w:val="false"/>
-                <w:sz w:val="18"/>
-                <w:szCs w:val="18"/>
-              </w:rPr>
-              <w:t xml:space="preserve"/>
-            </w:r>
-          </w:p>
-        </w:tc>
-      </w:tr>
-      <w:tr>
-        <w:tc>
-          <w:tcPr>
-            <w:tcW w:type="dxa" w:w="4660"/>
-          </w:tcPr>
-          <w:p>
-            <w:pPr>
-              <w:spacing w:after="40"/>
-            </w:pPr>
-            <w:r>
-              <w:rPr>
-                <w:b w:val="false"/>
-                <w:bCs w:val="false"/>
-                <w:sz w:val="18"/>
-                <w:szCs w:val="18"/>
-              </w:rPr>
-              <w:t xml:space="preserve">AURC, model disagreement signal</w:t>
-            </w:r>
-          </w:p>
-        </w:tc>
-        <w:tc>
-          <w:tcPr>
-            <w:tcW w:type="dxa" w:w="2330"/>
-          </w:tcPr>
-          <w:p>
-            <w:pPr>
-              <w:spacing w:after="40"/>
-            </w:pPr>
-            <w:r>
-              <w:rPr>
-                <w:b w:val="false"/>
-                <w:bCs w:val="false"/>
-                <w:sz w:val="18"/>
-                <w:szCs w:val="18"/>
-              </w:rPr>
-              <w:t xml:space="preserve">0.0011</w:t>
-            </w:r>
-          </w:p>
-        </w:tc>
-        <w:tc>
-          <w:tcPr>
-            <w:tcW w:type="dxa" w:w="2330"/>
-          </w:tcPr>
-          <w:p>
-            <w:pPr>
-              <w:spacing w:after="40"/>
-            </w:pPr>
-            <w:r>
-              <w:rPr>
-                <w:b w:val="false"/>
-                <w:bCs w:val="false"/>
-                <w:sz w:val="18"/>
-                <w:szCs w:val="18"/>
-              </w:rPr>
-              <w:t xml:space="preserve">lower is better</w:t>
-            </w:r>
-          </w:p>
-        </w:tc>
-      </w:tr>
-      <w:tr>
-        <w:tc>
-          <w:tcPr>
-            <w:tcW w:type="dxa" w:w="4660"/>
-          </w:tcPr>
-          <w:p>
-            <w:pPr>
-              <w:spacing w:after="40"/>
-            </w:pPr>
-            <w:r>
-              <w:rPr>
-                <w:b w:val="false"/>
-                <w:bCs w:val="false"/>
-                <w:sz w:val="18"/>
-                <w:szCs w:val="18"/>
-              </w:rPr>
-              <w:t xml:space="preserve">AURC, max-softmax baseline</w:t>
-            </w:r>
-          </w:p>
-        </w:tc>
-        <w:tc>
-          <w:tcPr>
-            <w:tcW w:type="dxa" w:w="2330"/>
-          </w:tcPr>
-          <w:p>
-            <w:pPr>
-              <w:spacing w:after="40"/>
-            </w:pPr>
-            <w:r>
-              <w:rPr>
-                <w:b w:val="false"/>
-                <w:bCs w:val="false"/>
-                <w:sz w:val="18"/>
-                <w:szCs w:val="18"/>
-              </w:rPr>
-              <w:t xml:space="preserve">0.0009</w:t>
-            </w:r>
-          </w:p>
-        </w:tc>
-        <w:tc>
-          <w:tcPr>
-            <w:tcW w:type="dxa" w:w="2330"/>
-          </w:tcPr>
-          <w:p>
-            <w:pPr>
-              <w:spacing w:after="40"/>
-            </w:pPr>
-            <w:r>
-              <w:rPr>
-                <w:b w:val="false"/>
-                <w:bCs w:val="false"/>
-                <w:sz w:val="18"/>
-                <w:szCs w:val="18"/>
-              </w:rPr>
-              <w:t xml:space="preserve">baseline wins here</w:t>
-            </w:r>
-          </w:p>
-        </w:tc>
-      </w:tr>
-      <w:tr>
-        <w:tc>
-          <w:tcPr>
-            <w:tcW w:type="dxa" w:w="4660"/>
-          </w:tcPr>
-          <w:p>
-            <w:pPr>
-              <w:spacing w:after="40"/>
-            </w:pPr>
-            <w:r>
-              <w:rPr>
-                <w:b w:val="false"/>
-                <w:bCs w:val="false"/>
-                <w:sz w:val="18"/>
-                <w:szCs w:val="18"/>
-              </w:rPr>
-              <w:t xml:space="preserve">Centerline patches / consensus-dry</w:t>
-            </w:r>
-          </w:p>
-        </w:tc>
-        <w:tc>
-          <w:tcPr>
-            <w:tcW w:type="dxa" w:w="2330"/>
-          </w:tcPr>
-          <w:p>
-            <w:pPr>
-              <w:spacing w:after="40"/>
-            </w:pPr>
-            <w:r>
-              <w:rPr>
-                <w:b w:val="false"/>
-                <w:bCs w:val="false"/>
-                <w:sz w:val="18"/>
-                <w:szCs w:val="18"/>
-              </w:rPr>
-              <w:t xml:space="preserve">52 / 0</w:t>
-            </w:r>
-          </w:p>
-        </w:tc>
-        <w:tc>
-          <w:tcPr>
-            <w:tcW w:type="dxa" w:w="2330"/>
-          </w:tcPr>
-          <w:p>
-            <w:pPr>
-              <w:spacing w:after="40"/>
-            </w:pPr>
-            <w:r>
-              <w:rPr>
-                <w:b w:val="false"/>
-                <w:bCs w:val="false"/>
-                <w:sz w:val="18"/>
-                <w:szCs w:val="18"/>
-              </w:rPr>
-              <w:t xml:space="preserve">no false break alarms</w:t>
-            </w:r>
-          </w:p>
-        </w:tc>
-      </w:tr>
-    </w:tbl>
-    <w:p>
-      <w:pPr>
-        <w:spacing w:after="120"/>
-      </w:pPr>
-      <w:r>
-        <w:t xml:space="preserve"/>
-      </w:r>
-    </w:p>
-    <w:p>
-      <w:pPr>
-        <w:pStyle w:val="Heading1"/>
+        <w:t xml:space="preserve">Figure 3. The full slice at Kazungula: weak truth, prediction, errors, disagreement, centerline check, risk-coverage.</w:t>
+      </w:r>
+    </w:p>
+    <w:p>
+      <w:pPr>
+        <w:pStyle w:val="Heading2"/>
         <w:spacing w:after="120" w:before="240"/>
       </w:pPr>
       <w:r>
-        <w:t xml:space="preserve">6. Findings</w:t>
+        <w:t xml:space="preserve">4.3 Four techniques at once (exp03)</w:t>
       </w:r>
     </w:p>
     <w:p>
@@ -1079,7 +1083,7 @@
         <w:spacing w:after="80"/>
       </w:pPr>
       <w:r>
-        <w:t xml:space="preserve">Spatial transfer works: heads trained 110 km away reach 97-98% accuracy on a distinct reach of the river.</w:t>
+        <w:t xml:space="preserve">Tile-phase perturbation (shift the input grid 1-3 px, measure prediction instability) was the first channel to beat the baseline (AURC 0.00058 vs 0.00089 on the easy scene).</w:t>
       </w:r>
     </w:p>
     <w:p>
@@ -1092,7 +1096,7 @@
         <w:spacing w:after="80"/>
       </w:pPr>
       <w:r>
-        <w:t xml:space="preserve">Prediction disagreement visibly traces the shoreline, consistent with the boundary-tracking seen at embedding level.</w:t>
+        <w:t xml:space="preserve">Naive three-model disagreement is worse than pairwise: the weakest model (Tiny, 95.1%) pollutes equal-weight aggregation. Replicated on AWF with Nano. Multi-rater disagreement needs reliability weighting.</w:t>
       </w:r>
     </w:p>
     <w:p>
@@ -1105,7 +1109,7 @@
         <w:spacing w:after="80"/>
       </w:pPr>
       <w:r>
-        <w:t xml:space="preserve">The geographic check is clean on an easy scene: 52 centerline patches, zero false break alarms.</w:t>
+        <w:t xml:space="preserve">Embedding distance to training data does not rank in-domain errors (4x worse than baseline). Its role is the OOD alarm, confirmed later by the delta result.</w:t>
       </w:r>
     </w:p>
     <w:p>
@@ -1118,7 +1122,153 @@
         <w:spacing w:after="80"/>
       </w:pPr>
       <w:r>
-        <w:t xml:space="preserve">The honest headline: on an easy dry-season scene with a 400 m river, the max-softmax baseline slightly beats the disagreement signal (AURC 0.0009 vs 0.0011). The model's own confidence is sufficient when the task is easy. The audit signals must earn their keep on hard cases: narrow channels, flood-season wetland margins, and correlated errors that confidence cannot see. That is the next experiment, and building the baseline in from day one is what makes the comparison trustworthy.</w:t>
+        <w:t xml:space="preserve">v1_2 checkpoints exist publicly but do not load with the current olmoearth_pretrain checkout (state_dict mismatch); the v1 vs v1_2 comparison needs the newer loader.</w:t>
+      </w:r>
+    </w:p>
+    <w:p>
+      <w:pPr>
+        <w:jc w:val="center"/>
+      </w:pPr>
+      <w:r>
+        <w:drawing>
+          <wp:inline distT="0" distB="0" distL="0" distR="0">
+            <wp:extent cx="5943600" cy="2828925"/>
+            <wp:effectExtent t="0" r="0" b="0" l="0"/>
+            <wp:docPr id="1" name="" descr="" title=""/>
+            <wp:cNvGraphicFramePr>
+              <a:graphicFrameLocks xmlns:a="http://schemas.openxmlformats.org/drawingml/2006/main" noChangeAspect="1"/>
+            </wp:cNvGraphicFramePr>
+            <a:graphic xmlns:a="http://schemas.openxmlformats.org/drawingml/2006/main">
+              <a:graphicData uri="http://schemas.openxmlformats.org/drawingml/2006/picture">
+                <pic:pic xmlns:pic="http://schemas.openxmlformats.org/drawingml/2006/picture">
+                  <pic:nvPicPr>
+                    <pic:cNvPr id="0" name="" descr=""/>
+                    <pic:cNvPicPr>
+                      <a:picLocks noChangeAspect="1" noChangeArrowheads="1"/>
+                    </pic:cNvPicPr>
+                  </pic:nvPicPr>
+                  <pic:blipFill>
+                    <a:blip r:embed="rId10" cstate="none"/>
+                    <a:srcRect/>
+                    <a:stretch>
+                      <a:fillRect/>
+                    </a:stretch>
+                  </pic:blipFill>
+                  <pic:spPr bwMode="auto">
+                    <a:xfrm>
+                      <a:off x="0" y="0"/>
+                      <a:ext cx="5943600" cy="2828925"/>
+                    </a:xfrm>
+                    <a:prstGeom prst="rect">
+                      <a:avLst/>
+                    </a:prstGeom>
+                  </pic:spPr>
+                </pic:pic>
+              </a:graphicData>
+            </a:graphic>
+          </wp:inline>
+        </w:drawing>
+      </w:r>
+    </w:p>
+    <w:p>
+      <w:pPr>
+        <w:spacing w:after="200"/>
+        <w:jc w:val="center"/>
+      </w:pPr>
+      <w:r>
+        <w:rPr>
+          <w:i/>
+          <w:iCs/>
+          <w:sz w:val="18"/>
+          <w:szCs w:val="18"/>
+        </w:rPr>
+        <w:t xml:space="preserve">Figure 4. Signal maps at Kazungula. Tile-phase traces the shoreline continuously; embedding distance is diffuse, as an OOD signal should be on in-domain data.</w:t>
+      </w:r>
+    </w:p>
+    <w:p>
+      <w:pPr>
+        <w:pStyle w:val="Heading2"/>
+        <w:spacing w:after="120" w:before="240"/>
+      </w:pPr>
+      <w:r>
+        <w:t xml:space="preserve">4.4 Real partner truth (exp04)</w:t>
+      </w:r>
+    </w:p>
+    <w:p>
+      <w:pPr>
+        <w:spacing w:after="120"/>
+      </w:pPr>
+      <w:r>
+        <w:t xml:space="preserve">The harness runs on the AWF partner dataset: 1459 expert-labeled points, 12-month Sentinel-2 stacks, the project's own spatial split. This is where the baseline earns respect: on 9-class in-domain confusion, max-softmax ranks errors better than any channel tested. Weakest class: herbaceous wetland (50% recall), the same terrain type where the water-task channels later won, which is a consistent story.</w:t>
+      </w:r>
+    </w:p>
+    <w:p>
+      <w:pPr>
+        <w:jc w:val="center"/>
+      </w:pPr>
+      <w:r>
+        <w:drawing>
+          <wp:inline distT="0" distB="0" distL="0" distR="0">
+            <wp:extent cx="5943600" cy="2228850"/>
+            <wp:effectExtent t="0" r="0" b="0" l="0"/>
+            <wp:docPr id="1" name="" descr="" title=""/>
+            <wp:cNvGraphicFramePr>
+              <a:graphicFrameLocks xmlns:a="http://schemas.openxmlformats.org/drawingml/2006/main" noChangeAspect="1"/>
+            </wp:cNvGraphicFramePr>
+            <a:graphic xmlns:a="http://schemas.openxmlformats.org/drawingml/2006/main">
+              <a:graphicData uri="http://schemas.openxmlformats.org/drawingml/2006/picture">
+                <pic:pic xmlns:pic="http://schemas.openxmlformats.org/drawingml/2006/picture">
+                  <pic:nvPicPr>
+                    <pic:cNvPr id="0" name="" descr=""/>
+                    <pic:cNvPicPr>
+                      <a:picLocks noChangeAspect="1" noChangeArrowheads="1"/>
+                    </pic:cNvPicPr>
+                  </pic:nvPicPr>
+                  <pic:blipFill>
+                    <a:blip r:embed="rId11" cstate="none"/>
+                    <a:srcRect/>
+                    <a:stretch>
+                      <a:fillRect/>
+                    </a:stretch>
+                  </pic:blipFill>
+                  <pic:spPr bwMode="auto">
+                    <a:xfrm>
+                      <a:off x="0" y="0"/>
+                      <a:ext cx="5943600" cy="2228850"/>
+                    </a:xfrm>
+                    <a:prstGeom prst="rect">
+                      <a:avLst/>
+                    </a:prstGeom>
+                  </pic:spPr>
+                </pic:pic>
+              </a:graphicData>
+            </a:graphic>
+          </wp:inline>
+        </w:drawing>
+      </w:r>
+    </w:p>
+    <w:p>
+      <w:pPr>
+        <w:spacing w:after="200"/>
+        <w:jc w:val="center"/>
+      </w:pPr>
+      <w:r>
+        <w:rPr>
+          <w:i/>
+          <w:iCs/>
+          <w:sz w:val="18"/>
+          <w:szCs w:val="18"/>
+        </w:rPr>
+        <w:t xml:space="preserve">Figure 5. Risk-coverage on AWF expert labels (left) and per-class recall (right).</w:t>
+      </w:r>
+    </w:p>
+    <w:p>
+      <w:pPr>
+        <w:pStyle w:val="Heading1"/>
+        <w:spacing w:after="120" w:before="240"/>
+      </w:pPr>
+      <w:r>
+        <w:t xml:space="preserve">5. Findings</w:t>
       </w:r>
     </w:p>
     <w:p>
@@ -1131,16 +1281,7 @@
         <w:spacing w:after="80"/>
       </w:pPr>
       <w:r>
-        <w:t xml:space="preserve">Part of the residual error is weak-truth drift (2021 labels vs 2024 scene, moving sandbars), not model error.</w:t>
-      </w:r>
-    </w:p>
-    <w:p>
-      <w:pPr>
-        <w:pStyle w:val="Heading1"/>
-        <w:spacing w:after="120" w:before="240"/>
-      </w:pPr>
-      <w:r>
-        <w:t xml:space="preserve">7. Next steps</w:t>
+        <w:t xml:space="preserve">The audit's core claim now has numbers: confidence suffices in-domain; evidence channels win where confidence fails (ambiguity, shift). Each channel owns a regime: disagreement on ambiguous margins, embedding distance on out-of-domain, perturbation on positional instability.</w:t>
       </w:r>
     </w:p>
     <w:p>
@@ -1153,7 +1294,7 @@
         <w:spacing w:after="80"/>
       </w:pPr>
       <w:r>
-        <w:t xml:space="preserve">A deliberately hard scene: sub-patch river width or flood-season Barotse floodplain, where the baseline should fail first.</w:t>
+        <w:t xml:space="preserve">Production inference exports (the continent-scale LCC run on HuggingFace, encoder v1.2-Base) carry binary-change probability, argmax classes, and top-1 probability, so the baseline comparison runs directly on production output, and the disagreement channels keep partial statistical power.</w:t>
       </w:r>
     </w:p>
     <w:p>
@@ -1166,7 +1307,7 @@
         <w:spacing w:after="80"/>
       </w:pPr>
       <w:r>
-        <w:t xml:space="preserve">Add Tiny for a three-model disagreement signal.</w:t>
+        <w:t xml:space="preserve">All v1 / v1_1 / v1_2 checkpoints and the AWF/mangrove/LCC labels are public: the entire audit runs on a laptop CPU with zero Ai2 infrastructure.</w:t>
       </w:r>
     </w:p>
     <w:p>
@@ -1179,7 +1320,16 @@
         <w:spacing w:after="80"/>
       </w:pPr>
       <w:r>
-        <w:t xml:space="preserve">v1 vs v1_2 comparison on identical windows (positional-artifact signal).</w:t>
+        <w:t xml:space="preserve">Honest caveats: WorldCover is weak truth on exactly the hard terrains; the shift-condition win still needs an expert-truth replication (AWF geographic-corner holdout is the planned design); AURC gaps on the easy scene rest on small error counts.</w:t>
+      </w:r>
+    </w:p>
+    <w:p>
+      <w:pPr>
+        <w:pStyle w:val="Heading1"/>
+        <w:spacing w:after="120" w:before="240"/>
+      </w:pPr>
+      <w:r>
+        <w:t xml:space="preserve">6. Next steps</w:t>
       </w:r>
     </w:p>
     <w:p>
@@ -1192,7 +1342,59 @@
         <w:spacing w:after="80"/>
       </w:pPr>
       <w:r>
-        <w:t xml:space="preserve">Confirm whether tiled inference exports keep per-class probabilities or argmax only; the disagreement signals gain power with probabilities.</w:t>
+        <w:t xml:space="preserve">Replicate the domain-shift result against expert truth (geographic-corner holdout on AWF).</w:t>
+      </w:r>
+    </w:p>
+    <w:p>
+      <w:pPr>
+        <w:pStyle w:val="ListParagraph"/>
+        <w:numPr>
+          <w:ilvl w:val="0"/>
+          <w:numId w:val="2"/>
+        </w:numPr>
+        <w:spacing w:after="80"/>
+      </w:pPr>
+      <w:r>
+        <w:t xml:space="preserve">E_geo sensitivity: find a scene with a real consensus break and show the centerline check fires; swap OSM for GRIT.</w:t>
+      </w:r>
+    </w:p>
+    <w:p>
+      <w:pPr>
+        <w:pStyle w:val="ListParagraph"/>
+        <w:numPr>
+          <w:ilvl w:val="0"/>
+          <w:numId w:val="2"/>
+        </w:numPr>
+        <w:spacing w:after="80"/>
+      </w:pPr>
+      <w:r>
+        <w:t xml:space="preserve">Reliability-weighted multi-model disagreement (Dawid-Skene direction) instead of naive std.</w:t>
+      </w:r>
+    </w:p>
+    <w:p>
+      <w:pPr>
+        <w:pStyle w:val="ListParagraph"/>
+        <w:numPr>
+          <w:ilvl w:val="0"/>
+          <w:numId w:val="2"/>
+        </w:numPr>
+        <w:spacing w:after="80"/>
+      </w:pPr>
+      <w:r>
+        <w:t xml:space="preserve">Audit a window of the production LCC output directly (COGs are HTTP range-readable): check water_contract/water_expand predictions against river centerlines.</w:t>
+      </w:r>
+    </w:p>
+    <w:p>
+      <w:pPr>
+        <w:pStyle w:val="ListParagraph"/>
+        <w:numPr>
+          <w:ilvl w:val="0"/>
+          <w:numId w:val="2"/>
+        </w:numPr>
+        <w:spacing w:after="80"/>
+      </w:pPr>
+      <w:r>
+        <w:t xml:space="preserve">Pull newer olmoearth_pretrain for the v1 vs v1_2 striping comparison.</w:t>
       </w:r>
     </w:p>
     <w:sectPr>

</xml_diff>

<commit_message>
Report final version: exp01-exp06, controls in results table, methodological assessment
</commit_message>
<xml_diff>
--- a/reports/2026-08-31_first_experiments.docx
+++ b/reports/2026-08-31_first_experiments.docx
@@ -10,10 +10,10 @@
         <w:rPr>
           <w:b/>
           <w:bCs/>
-          <w:sz w:val="36"/>
-          <w:szCs w:val="36"/>
+          <w:sz w:val="34"/>
+          <w:szCs w:val="34"/>
         </w:rPr>
-        <w:t xml:space="preserve">Auditing OlmoEarth Inference Quality Without Labels</w:t>
+        <w:t xml:space="preserve">Assessing OlmoEarth Inference Reliability Without Ground Truth: First Experiments</w:t>
       </w:r>
     </w:p>
     <w:p>
@@ -26,7 +26,7 @@
           <w:sz w:val="18"/>
           <w:szCs w:val="18"/>
         </w:rPr>
-        <w:t xml:space="preserve">First experiments (exp01-exp05). 2026-08-31. Repo: olmoearth_inferenceX (experimental).</w:t>
+        <w:t xml:space="preserve">Experiments exp01-exp06, 2026-08-31. Repository: github.com/2imi9/olmoearth_inferenceX. Standing per-technique record: docs/TECHNIQUES.md.</w:t>
       </w:r>
     </w:p>
     <w:p>
@@ -43,7 +43,7 @@
         <w:spacing w:after="120"/>
       </w:pPr>
       <w:r>
-        <w:t xml:space="preserve">OlmoEarth fine-tuned models produce predictions over regions where no ground-truth labels exist, and supervised eval metrics cannot say anything there. The goal is an audit: take an inference output and rank where it is most likely wrong, with the evidence attached. The output is a ranked list of suspect windows and risk-coverage curves, not a single accuracy number, because trustworthiness has no universal ground truth to certify against.</w:t>
+        <w:t xml:space="preserve">Fine-tuned earth observation models are routinely applied to regions without labels, where supervised evaluation metrics say nothing. The goal is an audit: given an inference output, rank the windows most likely to be wrong, with the evidence attached. The output is a ranked list with risk-coverage curves, not a single accuracy estimate, since regional trustworthiness has no universal ground truth to certify against.</w:t>
       </w:r>
     </w:p>
     <w:p>
@@ -52,7 +52,7 @@
         <w:spacing w:after="120" w:before="240"/>
       </w:pPr>
       <w:r>
-        <w:t xml:space="preserve">2. Approach</w:t>
+        <w:t xml:space="preserve">2. Approach and evaluation protocol</w:t>
       </w:r>
     </w:p>
     <w:p>
@@ -60,7 +60,7 @@
         <w:spacing w:after="120"/>
       </w:pPr>
       <w:r>
-        <w:t xml:space="preserve">The LLM community has spent several years on the same problem under the name hallucination detection: judging outputs with no reference answer. Those techniques mostly do not depend on language, so they port to earth observation, the same way the RoPE fix in OlmoEarth v1.2 ported an LLM mechanism to fix the v1 striping artifact.</w:t>
+        <w:t xml:space="preserve">The language-model literature has developed techniques for judging outputs without a reference answer. Most do not depend on language; these experiments test whether they transfer to geospatial inference.</w:t>
       </w:r>
     </w:p>
     <w:tbl>
@@ -117,7 +117,7 @@
                 <w:sz w:val="18"/>
                 <w:szCs w:val="18"/>
               </w:rPr>
-              <w:t xml:space="preserve">LLM technique it ports</w:t>
+              <w:t xml:space="preserve">Related LLM-domain method</w:t>
             </w:r>
           </w:p>
         </w:tc>
@@ -137,7 +137,7 @@
                 <w:sz w:val="18"/>
                 <w:szCs w:val="18"/>
               </w:rPr>
-              <w:t xml:space="preserve">OlmoEarth mechanism</w:t>
+              <w:t xml:space="preserve">Geospatial instantiation</w:t>
             </w:r>
           </w:p>
         </w:tc>
@@ -158,7 +158,7 @@
                 <w:sz w:val="18"/>
                 <w:szCs w:val="18"/>
               </w:rPr>
-              <w:t xml:space="preserve">Model disagreement (E_case)</w:t>
+              <w:t xml:space="preserve">E_case: cross-model disagreement</w:t>
             </w:r>
           </w:p>
         </w:tc>
@@ -177,7 +177,7 @@
                 <w:sz w:val="18"/>
                 <w:szCs w:val="18"/>
               </w:rPr>
-              <w:t xml:space="preserve">Self-consistency / SelfCheckGPT (Manakul et al., EMNLP 2023)</w:t>
+              <w:t xml:space="preserve">self-consistency; SelfCheckGPT (Manakul et al., EMNLP 2023)</w:t>
             </w:r>
           </w:p>
         </w:tc>
@@ -196,7 +196,7 @@
                 <w:sz w:val="18"/>
                 <w:szCs w:val="18"/>
               </w:rPr>
-              <w:t xml:space="preserve">Nano, Tiny and Base predictions diverge on suspect windows</w:t>
+              <w:t xml:space="preserve">divergence between Nano/Tiny/Base predictions on the same input</w:t>
             </w:r>
           </w:p>
         </w:tc>
@@ -217,7 +217,7 @@
                 <w:sz w:val="18"/>
                 <w:szCs w:val="18"/>
               </w:rPr>
-              <w:t xml:space="preserve">Perturbation stability (E_system)</w:t>
+              <w:t xml:space="preserve">E_system: perturbation stability</w:t>
             </w:r>
           </w:p>
         </w:tc>
@@ -236,7 +236,7 @@
                 <w:sz w:val="18"/>
                 <w:szCs w:val="18"/>
               </w:rPr>
-              <w:t xml:space="preserve">Semantic entropy (Farquhar et al., Nature 2024)</w:t>
+              <w:t xml:space="preserve">semantic entropy (Farquhar et al., Nature 2024)</w:t>
             </w:r>
           </w:p>
         </w:tc>
@@ -255,7 +255,7 @@
                 <w:sz w:val="18"/>
                 <w:szCs w:val="18"/>
               </w:rPr>
-              <w:t xml:space="preserve">Tile-grid phase shifts; catches positional artifacts such as the v1 striping</w:t>
+              <w:t xml:space="preserve">prediction variance under sub-patch shifts of the tiling grid</w:t>
             </w:r>
           </w:p>
         </w:tc>
@@ -276,7 +276,7 @@
                 <w:sz w:val="18"/>
                 <w:szCs w:val="18"/>
               </w:rPr>
-              <w:t xml:space="preserve">Geographic grounding (E_geo)</w:t>
+              <w:t xml:space="preserve">E_geo: geographic grounding</w:t>
             </w:r>
           </w:p>
         </w:tc>
@@ -295,7 +295,7 @@
                 <w:sz w:val="18"/>
                 <w:szCs w:val="18"/>
               </w:rPr>
-              <w:t xml:space="preserve">Retrieval-grounded fact checking</w:t>
+              <w:t xml:space="preserve">retrieval-grounded fact checking</w:t>
             </w:r>
           </w:p>
         </w:tc>
@@ -314,7 +314,7 @@
                 <w:sz w:val="18"/>
                 <w:szCs w:val="18"/>
               </w:rPr>
-              <w:t xml:space="preserve">Predictions checked against reference river centerlines (GRIT, GRWL, OSM)</w:t>
+              <w:t xml:space="preserve">prediction consistency against reference river centerlines (GRIT, GRWL, OSM)</w:t>
             </w:r>
           </w:p>
         </w:tc>
@@ -335,7 +335,7 @@
                 <w:sz w:val="18"/>
                 <w:szCs w:val="18"/>
               </w:rPr>
-              <w:t xml:space="preserve">Embedding dissimilarity (E_dist)</w:t>
+              <w:t xml:space="preserve">E_dist: embedding dissimilarity</w:t>
             </w:r>
           </w:p>
         </w:tc>
@@ -354,7 +354,7 @@
                 <w:sz w:val="18"/>
                 <w:szCs w:val="18"/>
               </w:rPr>
-              <w:t xml:space="preserve">Internal-state probing (INSIDE; semantic entropy probes)</w:t>
+              <w:t xml:space="preserve">internal-state probing (INSIDE; semantic entropy probes)</w:t>
             </w:r>
           </w:p>
         </w:tc>
@@ -373,7 +373,7 @@
                 <w:sz w:val="18"/>
                 <w:szCs w:val="18"/>
               </w:rPr>
-              <w:t xml:space="preserve">k-NN distance from training distribution in embedding space; no reruns needed</w:t>
+              <w:t xml:space="preserve">k-NN distance from the training distribution in embedding space</w:t>
             </w:r>
           </w:p>
         </w:tc>
@@ -392,7 +392,7 @@
         <w:spacing w:after="120"/>
       </w:pPr>
       <w:r>
-        <w:t xml:space="preserve">Two rules keep the audit honest. Signals are validated on labeled data but never trained on it. And every ranking is compared against the max-softmax confidence of the audited model itself, because a technique that cannot beat the model's own confidence is not worth shipping.</w:t>
+        <w:t xml:space="preserve">Protocol: signals are scored by AURC (area under the risk-coverage curve) against observed errors. Three disciplines apply throughout. Every signal is compared against the max-softmax confidence of the audited model, fixed as the baseline before experimentation. Labeled data is used only to evaluate signals, never to construct them, and all train/evaluation splits are spatial. No-model image-statistic controls (within-patch spectral variance, NDWI boundary proximity, NDWI gradient) are scored on identical errors to test whether model-based signals exceed what raw pixels provide.</w:t>
       </w:r>
     </w:p>
     <w:p>
@@ -401,15 +401,7 @@
         <w:spacing w:after="120" w:before="240"/>
       </w:pPr>
       <w:r>
-        <w:t xml:space="preserve">3. Headline result</w:t>
-      </w:r>
-    </w:p>
-    <w:p>
-      <w:pPr>
-        <w:spacing w:after="120"/>
-      </w:pPr>
-      <w:r>
-        <w:t xml:space="preserve">One day of experiments maps where the model's own confidence works and where the evidence channels earn their keep. Confidence wins on in-domain class confusion. It collapses on ambiguous wetland margins and under domain shift, where every evidence channel beats it, each strongest in its own regime:</w:t>
+        <w:t xml:space="preserve">3. Results</w:t>
       </w:r>
     </w:p>
     <w:tbl>
@@ -425,15 +417,15 @@
         </w:tblBorders>
       </w:tblPr>
       <w:tblGrid>
-        <w:gridCol w:w="3200"/>
-        <w:gridCol w:w="2040"/>
-        <w:gridCol w:w="2040"/>
-        <w:gridCol w:w="2040"/>
+        <w:gridCol w:w="2720"/>
+        <w:gridCol w:w="2200"/>
+        <w:gridCol w:w="2200"/>
+        <w:gridCol w:w="2200"/>
       </w:tblGrid>
       <w:tr>
         <w:tc>
           <w:tcPr>
-            <w:tcW w:type="dxa" w:w="3200"/>
+            <w:tcW w:type="dxa" w:w="2720"/>
             <w:shd w:fill="E8E8E8" w:val="clear"/>
           </w:tcPr>
           <w:p>
@@ -453,7 +445,7 @@
         </w:tc>
         <w:tc>
           <w:tcPr>
-            <w:tcW w:type="dxa" w:w="2040"/>
+            <w:tcW w:type="dxa" w:w="2200"/>
             <w:shd w:fill="E8E8E8" w:val="clear"/>
           </w:tcPr>
           <w:p>
@@ -467,13 +459,13 @@
                 <w:sz w:val="18"/>
                 <w:szCs w:val="18"/>
               </w:rPr>
-              <w:t xml:space="preserve">In-domain, expert labels (AWF, 9-class)</w:t>
-            </w:r>
-          </w:p>
-        </w:tc>
-        <w:tc>
-          <w:tcPr>
-            <w:tcW w:type="dxa" w:w="2040"/>
+              <w:t xml:space="preserve">In-domain, expert labels (AWF, 9-class, 51 errors)</w:t>
+            </w:r>
+          </w:p>
+        </w:tc>
+        <w:tc>
+          <w:tcPr>
+            <w:tcW w:type="dxa" w:w="2200"/>
             <w:shd w:fill="E8E8E8" w:val="clear"/>
           </w:tcPr>
           <w:p>
@@ -487,13 +479,13 @@
                 <w:sz w:val="18"/>
                 <w:szCs w:val="18"/>
               </w:rPr>
-              <w:t xml:space="preserve">Wetland margins (Barotse)</w:t>
-            </w:r>
-          </w:p>
-        </w:tc>
-        <w:tc>
-          <w:tcPr>
-            <w:tcW w:type="dxa" w:w="2040"/>
+              <w:t xml:space="preserve">Ambiguous wetland margins (Barotse, 97 errors)</w:t>
+            </w:r>
+          </w:p>
+        </w:tc>
+        <w:tc>
+          <w:tcPr>
+            <w:tcW w:type="dxa" w:w="2200"/>
             <w:shd w:fill="E8E8E8" w:val="clear"/>
           </w:tcPr>
           <w:p>
@@ -507,7 +499,7 @@
                 <w:sz w:val="18"/>
                 <w:szCs w:val="18"/>
               </w:rPr>
-              <w:t xml:space="preserve">Domain shift (mangrove delta)</w:t>
+              <w:t xml:space="preserve">Geographic shift (mangrove delta, 29 errors)</w:t>
             </w:r>
           </w:p>
         </w:tc>
@@ -515,45 +507,45 @@
       <w:tr>
         <w:tc>
           <w:tcPr>
-            <w:tcW w:type="dxa" w:w="3200"/>
-          </w:tcPr>
-          <w:p>
-            <w:pPr>
-              <w:spacing w:after="40"/>
-            </w:pPr>
-            <w:r>
-              <w:rPr>
-                <w:b w:val="false"/>
-                <w:bCs w:val="false"/>
-                <w:sz w:val="18"/>
-                <w:szCs w:val="18"/>
-              </w:rPr>
-              <w:t xml:space="preserve">Baseline max-softmax</w:t>
-            </w:r>
-          </w:p>
-        </w:tc>
-        <w:tc>
-          <w:tcPr>
-            <w:tcW w:type="dxa" w:w="2040"/>
-          </w:tcPr>
-          <w:p>
-            <w:pPr>
-              <w:spacing w:after="40"/>
-            </w:pPr>
-            <w:r>
-              <w:rPr>
-                <w:b w:val="false"/>
-                <w:bCs w:val="false"/>
-                <w:sz w:val="18"/>
-                <w:szCs w:val="18"/>
-              </w:rPr>
-              <w:t xml:space="preserve">0.0367  (best)</w:t>
-            </w:r>
-          </w:p>
-        </w:tc>
-        <w:tc>
-          <w:tcPr>
-            <w:tcW w:type="dxa" w:w="2040"/>
+            <w:tcW w:type="dxa" w:w="2720"/>
+          </w:tcPr>
+          <w:p>
+            <w:pPr>
+              <w:spacing w:after="40"/>
+            </w:pPr>
+            <w:r>
+              <w:rPr>
+                <w:b w:val="false"/>
+                <w:bCs w:val="false"/>
+                <w:sz w:val="18"/>
+                <w:szCs w:val="18"/>
+              </w:rPr>
+              <w:t xml:space="preserve">max-softmax confidence (baseline)</w:t>
+            </w:r>
+          </w:p>
+        </w:tc>
+        <w:tc>
+          <w:tcPr>
+            <w:tcW w:type="dxa" w:w="2200"/>
+          </w:tcPr>
+          <w:p>
+            <w:pPr>
+              <w:spacing w:after="40"/>
+            </w:pPr>
+            <w:r>
+              <w:rPr>
+                <w:b w:val="false"/>
+                <w:bCs w:val="false"/>
+                <w:sz w:val="18"/>
+                <w:szCs w:val="18"/>
+              </w:rPr>
+              <w:t xml:space="preserve">0.0367</w:t>
+            </w:r>
+          </w:p>
+        </w:tc>
+        <w:tc>
+          <w:tcPr>
+            <w:tcW w:type="dxa" w:w="2200"/>
           </w:tcPr>
           <w:p>
             <w:pPr>
@@ -572,7 +564,7 @@
         </w:tc>
         <w:tc>
           <w:tcPr>
-            <w:tcW w:type="dxa" w:w="2040"/>
+            <w:tcW w:type="dxa" w:w="2200"/>
           </w:tcPr>
           <w:p>
             <w:pPr>
@@ -593,7 +585,7 @@
       <w:tr>
         <w:tc>
           <w:tcPr>
-            <w:tcW w:type="dxa" w:w="3200"/>
+            <w:tcW w:type="dxa" w:w="2720"/>
           </w:tcPr>
           <w:p>
             <w:pPr>
@@ -612,7 +604,7 @@
         </w:tc>
         <w:tc>
           <w:tcPr>
-            <w:tcW w:type="dxa" w:w="2040"/>
+            <w:tcW w:type="dxa" w:w="2200"/>
           </w:tcPr>
           <w:p>
             <w:pPr>
@@ -631,26 +623,26 @@
         </w:tc>
         <w:tc>
           <w:tcPr>
-            <w:tcW w:type="dxa" w:w="2040"/>
-          </w:tcPr>
-          <w:p>
-            <w:pPr>
-              <w:spacing w:after="40"/>
-            </w:pPr>
-            <w:r>
-              <w:rPr>
-                <w:b w:val="false"/>
-                <w:bCs w:val="false"/>
-                <w:sz w:val="18"/>
-                <w:szCs w:val="18"/>
-              </w:rPr>
-              <w:t xml:space="preserve">0.0235  (best, 3x)</w:t>
-            </w:r>
-          </w:p>
-        </w:tc>
-        <w:tc>
-          <w:tcPr>
-            <w:tcW w:type="dxa" w:w="2040"/>
+            <w:tcW w:type="dxa" w:w="2200"/>
+          </w:tcPr>
+          <w:p>
+            <w:pPr>
+              <w:spacing w:after="40"/>
+            </w:pPr>
+            <w:r>
+              <w:rPr>
+                <w:b w:val="false"/>
+                <w:bCs w:val="false"/>
+                <w:sz w:val="18"/>
+                <w:szCs w:val="18"/>
+              </w:rPr>
+              <w:t xml:space="preserve">0.0235</w:t>
+            </w:r>
+          </w:p>
+        </w:tc>
+        <w:tc>
+          <w:tcPr>
+            <w:tcW w:type="dxa" w:w="2200"/>
           </w:tcPr>
           <w:p>
             <w:pPr>
@@ -671,7 +663,7 @@
       <w:tr>
         <w:tc>
           <w:tcPr>
-            <w:tcW w:type="dxa" w:w="3200"/>
+            <w:tcW w:type="dxa" w:w="2720"/>
           </w:tcPr>
           <w:p>
             <w:pPr>
@@ -690,7 +682,7 @@
         </w:tc>
         <w:tc>
           <w:tcPr>
-            <w:tcW w:type="dxa" w:w="2040"/>
+            <w:tcW w:type="dxa" w:w="2200"/>
           </w:tcPr>
           <w:p>
             <w:pPr>
@@ -709,7 +701,7 @@
         </w:tc>
         <w:tc>
           <w:tcPr>
-            <w:tcW w:type="dxa" w:w="2040"/>
+            <w:tcW w:type="dxa" w:w="2200"/>
           </w:tcPr>
           <w:p>
             <w:pPr>
@@ -728,7 +720,7 @@
         </w:tc>
         <w:tc>
           <w:tcPr>
-            <w:tcW w:type="dxa" w:w="2040"/>
+            <w:tcW w:type="dxa" w:w="2200"/>
           </w:tcPr>
           <w:p>
             <w:pPr>
@@ -749,26 +741,26 @@
       <w:tr>
         <w:tc>
           <w:tcPr>
-            <w:tcW w:type="dxa" w:w="3200"/>
-          </w:tcPr>
-          <w:p>
-            <w:pPr>
-              <w:spacing w:after="40"/>
-            </w:pPr>
-            <w:r>
-              <w:rPr>
-                <w:b w:val="false"/>
-                <w:bCs w:val="false"/>
-                <w:sz w:val="18"/>
-                <w:szCs w:val="18"/>
-              </w:rPr>
-              <w:t xml:space="preserve">E_dist knn-to-train</w:t>
-            </w:r>
-          </w:p>
-        </w:tc>
-        <w:tc>
-          <w:tcPr>
-            <w:tcW w:type="dxa" w:w="2040"/>
+            <w:tcW w:type="dxa" w:w="2720"/>
+          </w:tcPr>
+          <w:p>
+            <w:pPr>
+              <w:spacing w:after="40"/>
+            </w:pPr>
+            <w:r>
+              <w:rPr>
+                <w:b w:val="false"/>
+                <w:bCs w:val="false"/>
+                <w:sz w:val="18"/>
+                <w:szCs w:val="18"/>
+              </w:rPr>
+              <w:t xml:space="preserve">E_dist k-NN to training</w:t>
+            </w:r>
+          </w:p>
+        </w:tc>
+        <w:tc>
+          <w:tcPr>
+            <w:tcW w:type="dxa" w:w="2200"/>
           </w:tcPr>
           <w:p>
             <w:pPr>
@@ -787,7 +779,7 @@
         </w:tc>
         <w:tc>
           <w:tcPr>
-            <w:tcW w:type="dxa" w:w="2040"/>
+            <w:tcW w:type="dxa" w:w="2200"/>
           </w:tcPr>
           <w:p>
             <w:pPr>
@@ -806,20 +798,98 @@
         </w:tc>
         <w:tc>
           <w:tcPr>
-            <w:tcW w:type="dxa" w:w="2040"/>
-          </w:tcPr>
-          <w:p>
-            <w:pPr>
-              <w:spacing w:after="40"/>
-            </w:pPr>
-            <w:r>
-              <w:rPr>
-                <w:b w:val="false"/>
-                <w:bCs w:val="false"/>
-                <w:sz w:val="18"/>
-                <w:szCs w:val="18"/>
-              </w:rPr>
-              <w:t xml:space="preserve">0.0014  (best, 18x)</w:t>
+            <w:tcW w:type="dxa" w:w="2200"/>
+          </w:tcPr>
+          <w:p>
+            <w:pPr>
+              <w:spacing w:after="40"/>
+            </w:pPr>
+            <w:r>
+              <w:rPr>
+                <w:b w:val="false"/>
+                <w:bCs w:val="false"/>
+                <w:sz w:val="18"/>
+                <w:szCs w:val="18"/>
+              </w:rPr>
+              <w:t xml:space="preserve">0.0014</w:t>
+            </w:r>
+          </w:p>
+        </w:tc>
+      </w:tr>
+      <w:tr>
+        <w:tc>
+          <w:tcPr>
+            <w:tcW w:type="dxa" w:w="2720"/>
+          </w:tcPr>
+          <w:p>
+            <w:pPr>
+              <w:spacing w:after="40"/>
+            </w:pPr>
+            <w:r>
+              <w:rPr>
+                <w:b w:val="false"/>
+                <w:bCs w:val="false"/>
+                <w:sz w:val="18"/>
+                <w:szCs w:val="18"/>
+              </w:rPr>
+              <w:t xml:space="preserve">best no-model image statistic (control, exp06)</w:t>
+            </w:r>
+          </w:p>
+        </w:tc>
+        <w:tc>
+          <w:tcPr>
+            <w:tcW w:type="dxa" w:w="2200"/>
+          </w:tcPr>
+          <w:p>
+            <w:pPr>
+              <w:spacing w:after="40"/>
+            </w:pPr>
+            <w:r>
+              <w:rPr>
+                <w:b w:val="false"/>
+                <w:bCs w:val="false"/>
+                <w:sz w:val="18"/>
+                <w:szCs w:val="18"/>
+              </w:rPr>
+              <w:t xml:space="preserve">n/a</w:t>
+            </w:r>
+          </w:p>
+        </w:tc>
+        <w:tc>
+          <w:tcPr>
+            <w:tcW w:type="dxa" w:w="2200"/>
+          </w:tcPr>
+          <w:p>
+            <w:pPr>
+              <w:spacing w:after="40"/>
+            </w:pPr>
+            <w:r>
+              <w:rPr>
+                <w:b w:val="false"/>
+                <w:bCs w:val="false"/>
+                <w:sz w:val="18"/>
+                <w:szCs w:val="18"/>
+              </w:rPr>
+              <w:t xml:space="preserve">0.0384 (NDWI gradient)</w:t>
+            </w:r>
+          </w:p>
+        </w:tc>
+        <w:tc>
+          <w:tcPr>
+            <w:tcW w:type="dxa" w:w="2200"/>
+          </w:tcPr>
+          <w:p>
+            <w:pPr>
+              <w:spacing w:after="40"/>
+            </w:pPr>
+            <w:r>
+              <w:rPr>
+                <w:b w:val="false"/>
+                <w:bCs w:val="false"/>
+                <w:sz w:val="18"/>
+                <w:szCs w:val="18"/>
+              </w:rPr>
+              <w:t xml:space="preserve">0.0005 (NDWI gradient)</w:t>
             </w:r>
           </w:p>
         </w:tc>
@@ -838,7 +908,114 @@
         <w:spacing w:after="120"/>
       </w:pPr>
       <w:r>
-        <w:t xml:space="preserve">Column 1: frozen-Base head on the AWF partner project (expert labels from African Wildlife Foundation annotators, southern Kenya, official 1115/344 spatial split, 85.2% head accuracy vs 89.5% for the fully fine-tuned model). Columns 2-3: water task, heads trained at Katima Mulilo, evaluated on the Barotse floodplain interior and the Zambezi delta mangrove coast (~1300 km from training), scored against ESA WorldCover.</w:t>
+        <w:t xml:space="preserve">Column 1: linear head on frozen Base embeddings, AWF partner dataset (1459 expert-labeled points, the project's own 1115/344 spatial split; head accuracy 85.2% vs 89.5% for the fully fine-tuned model). Columns 2-3: binary water task, heads trained at Katima Mulilo, evaluated ~180 km and ~1300 km away respectively, scored against ESA WorldCover 2021.</w:t>
+      </w:r>
+    </w:p>
+    <w:p>
+      <w:pPr>
+        <w:spacing w:after="120"/>
+      </w:pPr>
+      <w:r>
+        <w:t xml:space="preserve">Three statements are supported, each with its limiting evidence:</w:t>
+      </w:r>
+    </w:p>
+    <w:p>
+      <w:pPr>
+        <w:pStyle w:val="ListParagraph"/>
+        <w:numPr>
+          <w:ilvl w:val="0"/>
+          <w:numId w:val="2"/>
+        </w:numPr>
+        <w:spacing w:after="80"/>
+      </w:pPr>
+      <w:r>
+        <w:t xml:space="preserve">In-domain, max-softmax confidence produced the best error ranking of all signals tested, on both the easy river scene (exp02) and the AWF expert-label task (exp04).</w:t>
+      </w:r>
+    </w:p>
+    <w:p>
+      <w:pPr>
+        <w:pStyle w:val="ListParagraph"/>
+        <w:numPr>
+          <w:ilvl w:val="0"/>
+          <w:numId w:val="2"/>
+        </w:numPr>
+        <w:spacing w:after="80"/>
+      </w:pPr>
+      <w:r>
+        <w:t xml:space="preserve">On the ambiguous-wetland scene, cross-model disagreement produced a better ranking than confidence (0.0235 vs 0.0666) and retained a margin over the best no-model statistic (0.0384). This is the one positive claim that has survived both the baseline and the controls (exp05, exp06).</w:t>
+      </w:r>
+    </w:p>
+    <w:p>
+      <w:pPr>
+        <w:pStyle w:val="ListParagraph"/>
+        <w:numPr>
+          <w:ilvl w:val="0"/>
+          <w:numId w:val="2"/>
+        </w:numPr>
+        <w:spacing w:after="80"/>
+      </w:pPr>
+      <w:r>
+        <w:t xml:space="preserve">Under geographic shift, confidence ranked errors worse than a plain NDWI gradient filter. However, no model signal outperformed the trivial statistics on that scene either: its errors are spectrally obvious reference omissions. The initially observed E_dist advantage (0.0014 vs 0.0258) is therefore withdrawn as evidence; the shift condition currently supports only the negative claim about confidence (exp06).</w:t>
+      </w:r>
+    </w:p>
+    <w:p>
+      <w:pPr>
+        <w:spacing w:after="120"/>
+      </w:pPr>
+      <w:r>
+        <w:t xml:space="preserve">Secondary findings:</w:t>
+      </w:r>
+    </w:p>
+    <w:p>
+      <w:pPr>
+        <w:pStyle w:val="ListParagraph"/>
+        <w:numPr>
+          <w:ilvl w:val="0"/>
+          <w:numId w:val="2"/>
+        </w:numPr>
+        <w:spacing w:after="80"/>
+      </w:pPr>
+      <w:r>
+        <w:t xml:space="preserve">Equal-weight disagreement across three models is worse than the best pairwise signal when one model is substantially weaker; observed independently on two tasks (exp03: Tiny; exp04: Nano). Multi-model aggregation appears to require reliability weighting.</w:t>
+      </w:r>
+    </w:p>
+    <w:p>
+      <w:pPr>
+        <w:pStyle w:val="ListParagraph"/>
+        <w:numPr>
+          <w:ilvl w:val="0"/>
+          <w:numId w:val="2"/>
+        </w:numPr>
+        <w:spacing w:after="80"/>
+      </w:pPr>
+      <w:r>
+        <w:t xml:space="preserve">Embedding distance to training data did not rank in-domain errors (worst signal in-domain); its proposed role as an out-of-distribution indicator remains untested on a valid shift testbed.</w:t>
+      </w:r>
+    </w:p>
+    <w:p>
+      <w:pPr>
+        <w:pStyle w:val="ListParagraph"/>
+        <w:numPr>
+          <w:ilvl w:val="0"/>
+          <w:numId w:val="2"/>
+        </w:numPr>
+        <w:spacing w:after="80"/>
+      </w:pPr>
+      <w:r>
+        <w:t xml:space="preserve">The geographic-grounding check produced zero false break alarms on a well-resolved scene (52 centerline patches); its sensitivity is untested, as no scene with a confirmed consensus break has been evaluated.</w:t>
+      </w:r>
+    </w:p>
+    <w:p>
+      <w:pPr>
+        <w:pStyle w:val="ListParagraph"/>
+        <w:numPr>
+          <w:ilvl w:val="0"/>
+          <w:numId w:val="2"/>
+        </w:numPr>
+        <w:spacing w:after="80"/>
+      </w:pPr>
+      <w:r>
+        <w:t xml:space="preserve">The published continent-scale LCC inference run (encoder OlmoEarth v1.2-Base) exports binary-change probability, argmax classes, and top-1 probability only; deployed audits must work with partial probability information.</w:t>
       </w:r>
     </w:p>
     <w:p>
@@ -848,7 +1025,7 @@
       <w:r>
         <w:drawing>
           <wp:inline distT="0" distB="0" distL="0" distR="0">
-            <wp:extent cx="5943600" cy="2809875"/>
+            <wp:extent cx="5943600" cy="3000375"/>
             <wp:effectExtent t="0" r="0" b="0" l="0"/>
             <wp:docPr id="1" name="" descr="" title=""/>
             <wp:cNvGraphicFramePr>
@@ -873,7 +1050,7 @@
                   <pic:spPr bwMode="auto">
                     <a:xfrm>
                       <a:off x="0" y="0"/>
-                      <a:ext cx="5943600" cy="2809875"/>
+                      <a:ext cx="5943600" cy="3000375"/>
                     </a:xfrm>
                     <a:prstGeom prst="rect">
                       <a:avLst/>
@@ -898,33 +1075,7 @@
           <w:sz w:val="18"/>
           <w:szCs w:val="18"/>
         </w:rPr>
-        <w:t xml:space="preserve">Figure 1. The hard scenes. Baseline (blue) collapses on both; model disagreement leads on wetland margins (top), embedding distance dominates under domain shift (bottom). Caveat: WorldCover is weak truth on these terrains, and part of the delta 'errors' trace a narrow river the reference likely misses.</w:t>
-      </w:r>
-    </w:p>
-    <w:p>
-      <w:pPr>
-        <w:pStyle w:val="Heading1"/>
-        <w:spacing w:after="120" w:before="240"/>
-      </w:pPr>
-      <w:r>
-        <w:t xml:space="preserve">4. Building blocks, in order</w:t>
-      </w:r>
-    </w:p>
-    <w:p>
-      <w:pPr>
-        <w:pStyle w:val="Heading2"/>
-        <w:spacing w:after="120" w:before="240"/>
-      </w:pPr>
-      <w:r>
-        <w:t xml:space="preserve">4.1 Where two models disagree (exp01)</w:t>
-      </w:r>
-    </w:p>
-    <w:p>
-      <w:pPr>
-        <w:spacing w:after="120"/>
-      </w:pPr>
-      <w:r>
-        <w:t xml:space="preserve">Nano and Base embeddings over the Zambezi at Kazungula, comparing local similarity structure per patch. Calibration first: on pure random input mean agreement is 0.59, not 0, because the models share patchification and normalization; all agreement reads against that floor. On the real scene disagreement is structured, not random: it clusters at boundaries and thin structures, where segmentation errors live.</w:t>
+        <w:t xml:space="preserve">Figure 1. The two difficult scenes (exp05). Panels show Sentinel-2 RGB, the WorldCover reference, model-reference disagreement (counted as error), and risk-coverage curves. The exp06 controls disqualify the lower scene as evidence for model-signal superiority.</w:t>
       </w:r>
     </w:p>
     <w:p>
@@ -934,7 +1085,7 @@
       <w:r>
         <w:drawing>
           <wp:inline distT="0" distB="0" distL="0" distR="0">
-            <wp:extent cx="5334000" cy="2428875"/>
+            <wp:extent cx="5943600" cy="2343150"/>
             <wp:effectExtent t="0" r="0" b="0" l="0"/>
             <wp:docPr id="1" name="" descr="" title=""/>
             <wp:cNvGraphicFramePr>
@@ -959,7 +1110,7 @@
                   <pic:spPr bwMode="auto">
                     <a:xfrm>
                       <a:off x="0" y="0"/>
-                      <a:ext cx="5334000" cy="2428875"/>
+                      <a:ext cx="5943600" cy="2343150"/>
                     </a:xfrm>
                     <a:prstGeom prst="rect">
                       <a:avLst/>
@@ -984,24 +1135,55 @@
           <w:sz w:val="18"/>
           <w:szCs w:val="18"/>
         </w:rPr>
-        <w:t xml:space="preserve">Figure 2. Open water agrees at 0.9+; disagreement concentrates on the shoreline and traces the bridge.</w:t>
-      </w:r>
-    </w:p>
-    <w:p>
-      <w:pPr>
-        <w:pStyle w:val="Heading2"/>
+        <w:t xml:space="preserve">Figure 2. AWF expert-label task (exp04): risk-coverage on the official spatial split, and per-class recall with class names verified against the project's model configuration. Note small per-class sample sizes (herbaceous wetland: n=6).</w:t>
+      </w:r>
+    </w:p>
+    <w:p>
+      <w:pPr>
+        <w:pStyle w:val="Heading1"/>
         <w:spacing w:after="120" w:before="240"/>
       </w:pPr>
       <w:r>
-        <w:t xml:space="preserve">4.2 The full audit slice (exp02)</w:t>
-      </w:r>
-    </w:p>
-    <w:p>
-      <w:pPr>
-        <w:spacing w:after="120"/>
-      </w:pPr>
-      <w:r>
-        <w:t xml:space="preserve">Every pipeline stage at minimal depth: water heads (logistic regression on frozen embeddings) trained at Katima Mulilo, evaluated at Kazungula 110 km away (spatial split), scored against WorldCover via risk-coverage. Spatial transfer reaches 97.9%. The geographic check is clean: 52 OSM centerline patches, zero false break alarms. And on this easy scene the baseline already edges the disagreement signal, which set up the question the rest of the day answered.</w:t>
+        <w:t xml:space="preserve">4. Supporting experiments</w:t>
+      </w:r>
+    </w:p>
+    <w:p>
+      <w:pPr>
+        <w:pStyle w:val="ListParagraph"/>
+        <w:numPr>
+          <w:ilvl w:val="0"/>
+          <w:numId w:val="2"/>
+        </w:numPr>
+        <w:spacing w:after="80"/>
+      </w:pPr>
+      <w:r>
+        <w:t xml:space="preserve">exp01: cross-model representation agreement is spatially structured, concentrating at class boundaries and thin structures; agreement on random input is ~0.59, not 0 (shared patchification), which sets the interpretation floor.</w:t>
+      </w:r>
+    </w:p>
+    <w:p>
+      <w:pPr>
+        <w:pStyle w:val="ListParagraph"/>
+        <w:numPr>
+          <w:ilvl w:val="0"/>
+          <w:numId w:val="2"/>
+        </w:numPr>
+        <w:spacing w:after="80"/>
+      </w:pPr>
+      <w:r>
+        <w:t xml:space="preserve">exp02: the full pipeline (weak labels, spatially split heads, disagreement and centerline signals, baseline, risk-coverage) runs end to end; spatial transfer of frozen-embedding heads reaches 97-98% at ~110 km.</w:t>
+      </w:r>
+    </w:p>
+    <w:p>
+      <w:pPr>
+        <w:pStyle w:val="ListParagraph"/>
+        <w:numPr>
+          <w:ilvl w:val="0"/>
+          <w:numId w:val="2"/>
+        </w:numPr>
+        <w:spacing w:after="80"/>
+      </w:pPr>
+      <w:r>
+        <w:t xml:space="preserve">exp03: tile-phase perturbation, three-model disagreement, embedding distance, and a v1_2 loading attempt (blocked by a loader version mismatch) evaluated on one scene.</w:t>
       </w:r>
     </w:p>
     <w:p>
@@ -1011,7 +1193,7 @@
       <w:r>
         <w:drawing>
           <wp:inline distT="0" distB="0" distL="0" distR="0">
-            <wp:extent cx="5943600" cy="3562350"/>
+            <wp:extent cx="5810250" cy="3562350"/>
             <wp:effectExtent t="0" r="0" b="0" l="0"/>
             <wp:docPr id="1" name="" descr="" title=""/>
             <wp:cNvGraphicFramePr>
@@ -1036,7 +1218,7 @@
                   <pic:spPr bwMode="auto">
                     <a:xfrm>
                       <a:off x="0" y="0"/>
-                      <a:ext cx="5943600" cy="3562350"/>
+                      <a:ext cx="5810250" cy="3562350"/>
                     </a:xfrm>
                     <a:prstGeom prst="rect">
                       <a:avLst/>
@@ -1061,68 +1243,7 @@
           <w:sz w:val="18"/>
           <w:szCs w:val="18"/>
         </w:rPr>
-        <w:t xml:space="preserve">Figure 3. The full slice at Kazungula: weak truth, prediction, errors, disagreement, centerline check, risk-coverage.</w:t>
-      </w:r>
-    </w:p>
-    <w:p>
-      <w:pPr>
-        <w:pStyle w:val="Heading2"/>
-        <w:spacing w:after="120" w:before="240"/>
-      </w:pPr>
-      <w:r>
-        <w:t xml:space="preserve">4.3 Four techniques at once (exp03)</w:t>
-      </w:r>
-    </w:p>
-    <w:p>
-      <w:pPr>
-        <w:pStyle w:val="ListParagraph"/>
-        <w:numPr>
-          <w:ilvl w:val="0"/>
-          <w:numId w:val="2"/>
-        </w:numPr>
-        <w:spacing w:after="80"/>
-      </w:pPr>
-      <w:r>
-        <w:t xml:space="preserve">Tile-phase perturbation (shift the input grid 1-3 px, measure prediction instability) was the first channel to beat the baseline (AURC 0.00058 vs 0.00089 on the easy scene).</w:t>
-      </w:r>
-    </w:p>
-    <w:p>
-      <w:pPr>
-        <w:pStyle w:val="ListParagraph"/>
-        <w:numPr>
-          <w:ilvl w:val="0"/>
-          <w:numId w:val="2"/>
-        </w:numPr>
-        <w:spacing w:after="80"/>
-      </w:pPr>
-      <w:r>
-        <w:t xml:space="preserve">Naive three-model disagreement is worse than pairwise: the weakest model (Tiny, 95.1%) pollutes equal-weight aggregation. Replicated on AWF with Nano. Multi-rater disagreement needs reliability weighting.</w:t>
-      </w:r>
-    </w:p>
-    <w:p>
-      <w:pPr>
-        <w:pStyle w:val="ListParagraph"/>
-        <w:numPr>
-          <w:ilvl w:val="0"/>
-          <w:numId w:val="2"/>
-        </w:numPr>
-        <w:spacing w:after="80"/>
-      </w:pPr>
-      <w:r>
-        <w:t xml:space="preserve">Embedding distance to training data does not rank in-domain errors (4x worse than baseline). Its role is the OOD alarm, confirmed later by the delta result.</w:t>
-      </w:r>
-    </w:p>
-    <w:p>
-      <w:pPr>
-        <w:pStyle w:val="ListParagraph"/>
-        <w:numPr>
-          <w:ilvl w:val="0"/>
-          <w:numId w:val="2"/>
-        </w:numPr>
-        <w:spacing w:after="80"/>
-      </w:pPr>
-      <w:r>
-        <w:t xml:space="preserve">v1_2 checkpoints exist publicly but do not load with the current olmoearth_pretrain checkout (state_dict mismatch); the v1 vs v1_2 comparison needs the newer loader.</w:t>
+        <w:t xml:space="preserve">Figure 3. Full pipeline at Kazungula (exp02).</w:t>
       </w:r>
     </w:p>
     <w:p>
@@ -1132,7 +1253,7 @@
       <w:r>
         <w:drawing>
           <wp:inline distT="0" distB="0" distL="0" distR="0">
-            <wp:extent cx="5943600" cy="2828925"/>
+            <wp:extent cx="5943600" cy="2857500"/>
             <wp:effectExtent t="0" r="0" b="0" l="0"/>
             <wp:docPr id="1" name="" descr="" title=""/>
             <wp:cNvGraphicFramePr>
@@ -1157,7 +1278,7 @@
                   <pic:spPr bwMode="auto">
                     <a:xfrm>
                       <a:off x="0" y="0"/>
-                      <a:ext cx="5943600" cy="2828925"/>
+                      <a:ext cx="5943600" cy="2857500"/>
                     </a:xfrm>
                     <a:prstGeom prst="rect">
                       <a:avLst/>
@@ -1182,84 +1303,7 @@
           <w:sz w:val="18"/>
           <w:szCs w:val="18"/>
         </w:rPr>
-        <w:t xml:space="preserve">Figure 4. Signal maps at Kazungula. Tile-phase traces the shoreline continuously; embedding distance is diffuse, as an OOD signal should be on in-domain data.</w:t>
-      </w:r>
-    </w:p>
-    <w:p>
-      <w:pPr>
-        <w:pStyle w:val="Heading2"/>
-        <w:spacing w:after="120" w:before="240"/>
-      </w:pPr>
-      <w:r>
-        <w:t xml:space="preserve">4.4 Real partner truth (exp04)</w:t>
-      </w:r>
-    </w:p>
-    <w:p>
-      <w:pPr>
-        <w:spacing w:after="120"/>
-      </w:pPr>
-      <w:r>
-        <w:t xml:space="preserve">The harness runs on the AWF partner dataset: 1459 expert-labeled points, 12-month Sentinel-2 stacks, the project's own spatial split. This is where the baseline earns respect: on 9-class in-domain confusion, max-softmax ranks errors better than any channel tested. Weakest class: herbaceous wetland (50% recall), the same terrain type where the water-task channels later won, which is a consistent story.</w:t>
-      </w:r>
-    </w:p>
-    <w:p>
-      <w:pPr>
-        <w:jc w:val="center"/>
-      </w:pPr>
-      <w:r>
-        <w:drawing>
-          <wp:inline distT="0" distB="0" distL="0" distR="0">
-            <wp:extent cx="5943600" cy="2228850"/>
-            <wp:effectExtent t="0" r="0" b="0" l="0"/>
-            <wp:docPr id="1" name="" descr="" title=""/>
-            <wp:cNvGraphicFramePr>
-              <a:graphicFrameLocks xmlns:a="http://schemas.openxmlformats.org/drawingml/2006/main" noChangeAspect="1"/>
-            </wp:cNvGraphicFramePr>
-            <a:graphic xmlns:a="http://schemas.openxmlformats.org/drawingml/2006/main">
-              <a:graphicData uri="http://schemas.openxmlformats.org/drawingml/2006/picture">
-                <pic:pic xmlns:pic="http://schemas.openxmlformats.org/drawingml/2006/picture">
-                  <pic:nvPicPr>
-                    <pic:cNvPr id="0" name="" descr=""/>
-                    <pic:cNvPicPr>
-                      <a:picLocks noChangeAspect="1" noChangeArrowheads="1"/>
-                    </pic:cNvPicPr>
-                  </pic:nvPicPr>
-                  <pic:blipFill>
-                    <a:blip r:embed="rId11" cstate="none"/>
-                    <a:srcRect/>
-                    <a:stretch>
-                      <a:fillRect/>
-                    </a:stretch>
-                  </pic:blipFill>
-                  <pic:spPr bwMode="auto">
-                    <a:xfrm>
-                      <a:off x="0" y="0"/>
-                      <a:ext cx="5943600" cy="2228850"/>
-                    </a:xfrm>
-                    <a:prstGeom prst="rect">
-                      <a:avLst/>
-                    </a:prstGeom>
-                  </pic:spPr>
-                </pic:pic>
-              </a:graphicData>
-            </a:graphic>
-          </wp:inline>
-        </w:drawing>
-      </w:r>
-    </w:p>
-    <w:p>
-      <w:pPr>
-        <w:spacing w:after="200"/>
-        <w:jc w:val="center"/>
-      </w:pPr>
-      <w:r>
-        <w:rPr>
-          <w:i/>
-          <w:iCs/>
-          <w:sz w:val="18"/>
-          <w:szCs w:val="18"/>
-        </w:rPr>
-        <w:t xml:space="preserve">Figure 5. Risk-coverage on AWF expert labels (left) and per-class recall (right).</w:t>
+        <w:t xml:space="preserve">Figure 4. Signal maps at Kazungula (exp03).</w:t>
       </w:r>
     </w:p>
     <w:p>
@@ -1268,7 +1312,32 @@
         <w:spacing w:after="120" w:before="240"/>
       </w:pPr>
       <w:r>
-        <w:t xml:space="preserve">5. Findings</w:t>
+        <w:t xml:space="preserve">5. Methodological assessment</w:t>
+      </w:r>
+    </w:p>
+    <w:p>
+      <w:pPr>
+        <w:spacing w:after="120"/>
+      </w:pPr>
+      <w:r>
+        <w:t xml:space="preserve">Practices that meet the standard: a pre-committed strong baseline that was allowed to win (and did, in-domain); negative controls that were allowed to remove a result (and did, for the shift claim); spatial splits throughout, including the partner project's own split; evaluation labels never used to construct signals; class mappings and export formats verified against source configuration; deterministic seeds and cached intermediates for reproduction.</w:t>
+      </w:r>
+    </w:p>
+    <w:p>
+      <w:pPr>
+        <w:spacing w:after="120"/>
+      </w:pPr>
+      <w:r>
+        <w:t xml:space="preserve">Limitations that keep this at pilot scale: each condition rests on a single scene or task, with small error counts and no confidence intervals or significance tests. ESA WorldCover is the reference on the unlabeled-region scenes and is least reliable on exactly the terrains of interest, so a fraction of measured error is reference error. The difficult scenes were selected because baseline failure was expected there; confirmation requires scenes chosen by a pre-stated rule. Accurate status: a hypothesis-generating pilot whose one surviving positive claim awaits replication.</w:t>
+      </w:r>
+    </w:p>
+    <w:p>
+      <w:pPr>
+        <w:pStyle w:val="Heading1"/>
+        <w:spacing w:after="120" w:before="240"/>
+      </w:pPr>
+      <w:r>
+        <w:t xml:space="preserve">6. Next steps</w:t>
       </w:r>
     </w:p>
     <w:p>
@@ -1281,7 +1350,7 @@
         <w:spacing w:after="80"/>
       </w:pPr>
       <w:r>
-        <w:t xml:space="preserve">The audit's core claim now has numbers: confidence suffices in-domain; evidence channels win where confidence fails (ambiguity, shift). Each channel owns a regime: disagreement on ambiguous margins, embedding distance on out-of-domain, perturbation on positional instability.</w:t>
+        <w:t xml:space="preserve">A domain-shift testbed with non-trivial errors and expert labels (geographic-corner holdout within AWF), with multiple scenes and confidence intervals on AURC.</w:t>
       </w:r>
     </w:p>
     <w:p>
@@ -1294,7 +1363,7 @@
         <w:spacing w:after="80"/>
       </w:pPr>
       <w:r>
-        <w:t xml:space="preserve">Production inference exports (the continent-scale LCC run on HuggingFace, encoder v1.2-Base) carry binary-change probability, argmax classes, and top-1 probability, so the baseline comparison runs directly on production output, and the disagreement channels keep partial statistical power.</w:t>
+        <w:t xml:space="preserve">Sensitivity test for the geographic-grounding check on a scene with a confirmed consensus break; replace OSM centerlines with GRIT.</w:t>
       </w:r>
     </w:p>
     <w:p>
@@ -1307,7 +1376,7 @@
         <w:spacing w:after="80"/>
       </w:pPr>
       <w:r>
-        <w:t xml:space="preserve">All v1 / v1_1 / v1_2 checkpoints and the AWF/mangrove/LCC labels are public: the entire audit runs on a laptop CPU with zero Ai2 infrastructure.</w:t>
+        <w:t xml:space="preserve">Reliability-weighted multi-model aggregation (Dawid-Skene direction).</w:t>
       </w:r>
     </w:p>
     <w:p>
@@ -1320,16 +1389,7 @@
         <w:spacing w:after="80"/>
       </w:pPr>
       <w:r>
-        <w:t xml:space="preserve">Honest caveats: WorldCover is weak truth on exactly the hard terrains; the shift-condition win still needs an expert-truth replication (AWF geographic-corner holdout is the planned design); AURC gaps on the easy scene rest on small error counts.</w:t>
-      </w:r>
-    </w:p>
-    <w:p>
-      <w:pPr>
-        <w:pStyle w:val="Heading1"/>
-        <w:spacing w:after="120" w:before="240"/>
-      </w:pPr>
-      <w:r>
-        <w:t xml:space="preserve">6. Next steps</w:t>
+        <w:t xml:space="preserve">v1 vs v1.2 comparison on identical windows after updating the encoder loader.</w:t>
       </w:r>
     </w:p>
     <w:p>
@@ -1342,59 +1402,7 @@
         <w:spacing w:after="80"/>
       </w:pPr>
       <w:r>
-        <w:t xml:space="preserve">Replicate the domain-shift result against expert truth (geographic-corner holdout on AWF).</w:t>
-      </w:r>
-    </w:p>
-    <w:p>
-      <w:pPr>
-        <w:pStyle w:val="ListParagraph"/>
-        <w:numPr>
-          <w:ilvl w:val="0"/>
-          <w:numId w:val="2"/>
-        </w:numPr>
-        <w:spacing w:after="80"/>
-      </w:pPr>
-      <w:r>
-        <w:t xml:space="preserve">E_geo sensitivity: find a scene with a real consensus break and show the centerline check fires; swap OSM for GRIT.</w:t>
-      </w:r>
-    </w:p>
-    <w:p>
-      <w:pPr>
-        <w:pStyle w:val="ListParagraph"/>
-        <w:numPr>
-          <w:ilvl w:val="0"/>
-          <w:numId w:val="2"/>
-        </w:numPr>
-        <w:spacing w:after="80"/>
-      </w:pPr>
-      <w:r>
-        <w:t xml:space="preserve">Reliability-weighted multi-model disagreement (Dawid-Skene direction) instead of naive std.</w:t>
-      </w:r>
-    </w:p>
-    <w:p>
-      <w:pPr>
-        <w:pStyle w:val="ListParagraph"/>
-        <w:numPr>
-          <w:ilvl w:val="0"/>
-          <w:numId w:val="2"/>
-        </w:numPr>
-        <w:spacing w:after="80"/>
-      </w:pPr>
-      <w:r>
-        <w:t xml:space="preserve">Audit a window of the production LCC output directly (COGs are HTTP range-readable): check water_contract/water_expand predictions against river centerlines.</w:t>
-      </w:r>
-    </w:p>
-    <w:p>
-      <w:pPr>
-        <w:pStyle w:val="ListParagraph"/>
-        <w:numPr>
-          <w:ilvl w:val="0"/>
-          <w:numId w:val="2"/>
-        </w:numPr>
-        <w:spacing w:after="80"/>
-      </w:pPr>
-      <w:r>
-        <w:t xml:space="preserve">Pull newer olmoearth_pretrain for the v1 vs v1_2 striping comparison.</w:t>
+        <w:t xml:space="preserve">Direct audit of a window of the published LCC production output via HTTP range reads.</w:t>
       </w:r>
     </w:p>
     <w:sectPr>

</xml_diff>